<commit_message>
docs: adjust Surat Undangan Welcome Day letter number to follow e-office numbering convention (002/UND/PSB/PP-AI/VI/2026)
</commit_message>
<xml_diff>
--- a/file dari media/003-Surat Undangan Welcome Day Pesantren Al Imam Al Islami.docx
+++ b/file dari media/003-Surat Undangan Welcome Day Pesantren Al Imam Al Islami.docx
@@ -1,6 +1,6 @@
 
 <file path=word/document.xml><?xml version="1.0" encoding="utf-8"?>
-<w:document xmlns:wpc="http://schemas.microsoft.com/office/word/2010/wordprocessingCanvas" xmlns:cx="http://schemas.microsoft.com/office/drawing/2014/chartex" xmlns:cx1="http://schemas.microsoft.com/office/drawing/2015/9/8/chartex" xmlns:cx2="http://schemas.microsoft.com/office/drawing/2015/10/21/chartex" xmlns:cx3="http://schemas.microsoft.com/office/drawing/2016/5/9/chartex" xmlns:cx4="http://schemas.microsoft.com/office/drawing/2016/5/10/chartex" xmlns:cx5="http://schemas.microsoft.com/office/drawing/2016/5/11/chartex" xmlns:cx6="http://schemas.microsoft.com/office/drawing/2016/5/12/chartex" xmlns:cx7="http://schemas.microsoft.com/office/drawing/2016/5/13/chartex" xmlns:cx8="http://schemas.microsoft.com/office/drawing/2016/5/14/chartex" xmlns:mc="http://schemas.openxmlformats.org/markup-compatibility/2006" xmlns:aink="http://schemas.microsoft.com/office/drawing/2016/ink" xmlns:am3d="http://schemas.microsoft.com/office/drawing/2017/model3d" xmlns:o="urn:schemas-microsoft-com:office:office" xmlns:oel="http://schemas.microsoft.com/office/2019/extlst" xmlns:r="http://schemas.openxmlformats.org/officeDocument/2006/relationships" xmlns:m="http://schemas.openxmlformats.org/officeDocument/2006/math" xmlns:v="urn:schemas-microsoft-com:vml" xmlns:wp14="http://schemas.microsoft.com/office/word/2010/wordprocessingDrawing" xmlns:wp="http://schemas.openxmlformats.org/drawingml/2006/wordprocessingDrawing" xmlns:w10="urn:schemas-microsoft-com:office:word" xmlns:w="http://schemas.openxmlformats.org/wordprocessingml/2006/main" xmlns:w14="http://schemas.microsoft.com/office/word/2010/wordml" xmlns:w15="http://schemas.microsoft.com/office/word/2012/wordml" xmlns:w16cex="http://schemas.microsoft.com/office/word/2018/wordml/cex" xmlns:w16cid="http://schemas.microsoft.com/office/word/2016/wordml/cid" xmlns:w16="http://schemas.microsoft.com/office/word/2018/wordml" xmlns:w16du="http://schemas.microsoft.com/office/word/2023/wordml/word16du" xmlns:w16sdtdh="http://schemas.microsoft.com/office/word/2020/wordml/sdtdatahash" xmlns:w16sdtfl="http://schemas.microsoft.com/office/word/2024/wordml/sdtformatlock" xmlns:w16se="http://schemas.microsoft.com/office/word/2015/wordml/symex" xmlns:wpg="http://schemas.microsoft.com/office/word/2010/wordprocessingGroup" xmlns:wpi="http://schemas.microsoft.com/office/word/2010/wordprocessingInk" xmlns:wne="http://schemas.microsoft.com/office/word/2006/wordml" xmlns:wps="http://schemas.microsoft.com/office/word/2010/wordprocessingShape" mc:Ignorable="w14 w15 w16se w16cid w16 w16cex w16sdtdh w16sdtfl w16du wp14">
+<w:document xmlns:wpc="http://schemas.microsoft.com/office/word/2010/wordprocessingCanvas" xmlns:cx="http://schemas.microsoft.com/office/drawing/2014/chartex" xmlns:cx1="http://schemas.microsoft.com/office/drawing/2015/9/8/chartex" xmlns:cx2="http://schemas.microsoft.com/office/drawing/2015/10/21/chartex" xmlns:cx3="http://schemas.microsoft.com/office/drawing/2016/5/9/chartex" xmlns:cx4="http://schemas.microsoft.com/office/drawing/2016/5/10/chartex" xmlns:cx5="http://schemas.microsoft.com/office/drawing/2016/5/11/chartex" xmlns:cx6="http://schemas.microsoft.com/office/drawing/2016/5/12/chartex" xmlns:cx7="http://schemas.microsoft.com/office/drawing/2016/5/13/chartex" xmlns:cx8="http://schemas.microsoft.com/office/drawing/2016/5/14/chartex" xmlns:mc="http://schemas.openxmlformats.org/markup-compatibility/2006" xmlns:aink="http://schemas.microsoft.com/office/drawing/2016/ink" xmlns:am3d="http://schemas.microsoft.com/office/drawing/2017/model3d" xmlns:o="urn:schemas-microsoft-com:office:office" xmlns:oel="http://schemas.microsoft.com/office/2019/extlst" xmlns:r="http://schemas.openxmlformats.org/officeDocument/2006/relationships" xmlns:m="http://schemas.openxmlformats.org/officeDocument/2006/math" xmlns:v="urn:schemas-microsoft-com:vml" xmlns:wp14="http://schemas.microsoft.com/office/word/2010/wordprocessingDrawing" xmlns:wp="http://schemas.openxmlformats.org/drawingml/2006/wordprocessingDrawing" xmlns:w10="urn:schemas-microsoft-com:office:word" xmlns:w="http://schemas.openxmlformats.org/wordprocessingml/2006/main" xmlns:w14="http://schemas.microsoft.com/office/word/2010/wordml" xmlns:w15="http://schemas.microsoft.com/office/word/2012/wordml" xmlns:w16cex="http://schemas.microsoft.com/office/word/2018/wordml/cex" xmlns:w16cid="http://schemas.microsoft.com/office/word/2016/wordml/cid" xmlns:w16="http://schemas.microsoft.com/office/word/2018/wordml" xmlns:w16sdtdh="http://schemas.microsoft.com/office/word/2020/wordml/sdtdatahash" xmlns:w16se="http://schemas.microsoft.com/office/word/2015/wordml/symex" xmlns:wpg="http://schemas.microsoft.com/office/word/2010/wordprocessingGroup" xmlns:wpi="http://schemas.microsoft.com/office/word/2010/wordprocessingInk" xmlns:wne="http://schemas.microsoft.com/office/word/2006/wordml" xmlns:wps="http://schemas.microsoft.com/office/word/2010/wordprocessingShape" mc:Ignorable="w14 w15 w16se w16cid w16 w16cex w16sdtdh wp14">
   <w:body>
     <w:p>
       <w:pPr>
@@ -78,51 +78,7 @@
           <w:szCs w:val="24"/>
           <w:lang w:val="sv-SE"/>
         </w:rPr>
-        <w:t>0</w:t>
-      </w:r>
-      <w:r>
-        <w:rPr>
-          <w:rFonts w:ascii="Times New Roman" w:hAnsi="Times New Roman" w:cs="Times New Roman"/>
-          <w:b/>
-          <w:bCs/>
-          <w:sz w:val="24"/>
-          <w:szCs w:val="24"/>
-          <w:lang w:val="sv-SE"/>
-        </w:rPr>
-        <w:t>03</w:t>
-      </w:r>
-      <w:r>
-        <w:rPr>
-          <w:rFonts w:ascii="Times New Roman" w:hAnsi="Times New Roman" w:cs="Times New Roman"/>
-          <w:b/>
-          <w:bCs/>
-          <w:sz w:val="24"/>
-          <w:szCs w:val="24"/>
-          <w:lang w:val="sv-SE"/>
-        </w:rPr>
-        <w:t>/</w:t>
-      </w:r>
-      <w:r>
-        <w:rPr>
-          <w:rFonts w:ascii="Times New Roman" w:hAnsi="Times New Roman" w:cs="Times New Roman"/>
-          <w:b/>
-          <w:bCs/>
-          <w:sz w:val="24"/>
-          <w:szCs w:val="24"/>
-          <w:lang w:val="sv-SE"/>
-        </w:rPr>
-        <w:t>Pan-WD/AI</w:t>
-      </w:r>
-      <w:r>
-        <w:rPr>
-          <w:rFonts w:ascii="Times New Roman" w:hAnsi="Times New Roman" w:cs="Times New Roman"/>
-          <w:b/>
-          <w:bCs/>
-          <w:sz w:val="24"/>
-          <w:szCs w:val="24"/>
-          <w:lang w:val="sv-SE"/>
-        </w:rPr>
-        <w:t>/VI/2026</w:t>
+        <w:t>002/UND/PSB/PP-AI/VI/2026</w:t>
       </w:r>
     </w:p>
     <w:p>
@@ -294,18 +250,7 @@
           <w:szCs w:val="24"/>
           <w:lang w:val="sv-SE"/>
         </w:rPr>
-        <w:t xml:space="preserve">Bapak </w:t>
-      </w:r>
-      <w:r>
-        <w:rPr>
-          <w:rFonts w:ascii="Times New Roman" w:hAnsi="Times New Roman" w:cs="Times New Roman"/>
-          <w:b/>
-          <w:bCs/>
-          <w:sz w:val="24"/>
-          <w:szCs w:val="24"/>
-          <w:lang w:val="sv-SE"/>
-        </w:rPr>
-        <w:t>Asep Rusli Rusmawijaya, S.Pd., M.Pd</w:t>
+        <w:t>Bapak Asep Rusli Rusmawijaya, S.Pd., M.Pd</w:t>
       </w:r>
       <w:r>
         <w:rPr>
@@ -1582,51 +1527,7 @@
           <w:szCs w:val="24"/>
           <w:lang w:val="sv-SE"/>
         </w:rPr>
-        <w:t>0</w:t>
-      </w:r>
-      <w:r>
-        <w:rPr>
-          <w:rFonts w:ascii="Times New Roman" w:hAnsi="Times New Roman" w:cs="Times New Roman"/>
-          <w:b/>
-          <w:bCs/>
-          <w:sz w:val="24"/>
-          <w:szCs w:val="24"/>
-          <w:lang w:val="sv-SE"/>
-        </w:rPr>
-        <w:t>03</w:t>
-      </w:r>
-      <w:r>
-        <w:rPr>
-          <w:rFonts w:ascii="Times New Roman" w:hAnsi="Times New Roman" w:cs="Times New Roman"/>
-          <w:b/>
-          <w:bCs/>
-          <w:sz w:val="24"/>
-          <w:szCs w:val="24"/>
-          <w:lang w:val="sv-SE"/>
-        </w:rPr>
-        <w:t>/</w:t>
-      </w:r>
-      <w:r>
-        <w:rPr>
-          <w:rFonts w:ascii="Times New Roman" w:hAnsi="Times New Roman" w:cs="Times New Roman"/>
-          <w:b/>
-          <w:bCs/>
-          <w:sz w:val="24"/>
-          <w:szCs w:val="24"/>
-          <w:lang w:val="sv-SE"/>
-        </w:rPr>
-        <w:t>Pan-WD/AI</w:t>
-      </w:r>
-      <w:r>
-        <w:rPr>
-          <w:rFonts w:ascii="Times New Roman" w:hAnsi="Times New Roman" w:cs="Times New Roman"/>
-          <w:b/>
-          <w:bCs/>
-          <w:sz w:val="24"/>
-          <w:szCs w:val="24"/>
-          <w:lang w:val="sv-SE"/>
-        </w:rPr>
-        <w:t>/VI/2026</w:t>
+        <w:t>002/UND/PSB/PP-AI/VI/2026</w:t>
       </w:r>
     </w:p>
     <w:p>
@@ -2966,51 +2867,7 @@
           <w:szCs w:val="24"/>
           <w:lang w:val="sv-SE"/>
         </w:rPr>
-        <w:t>0</w:t>
-      </w:r>
-      <w:r>
-        <w:rPr>
-          <w:rFonts w:ascii="Times New Roman" w:hAnsi="Times New Roman" w:cs="Times New Roman"/>
-          <w:b/>
-          <w:bCs/>
-          <w:sz w:val="24"/>
-          <w:szCs w:val="24"/>
-          <w:lang w:val="sv-SE"/>
-        </w:rPr>
-        <w:t>03</w:t>
-      </w:r>
-      <w:r>
-        <w:rPr>
-          <w:rFonts w:ascii="Times New Roman" w:hAnsi="Times New Roman" w:cs="Times New Roman"/>
-          <w:b/>
-          <w:bCs/>
-          <w:sz w:val="24"/>
-          <w:szCs w:val="24"/>
-          <w:lang w:val="sv-SE"/>
-        </w:rPr>
-        <w:t>/</w:t>
-      </w:r>
-      <w:r>
-        <w:rPr>
-          <w:rFonts w:ascii="Times New Roman" w:hAnsi="Times New Roman" w:cs="Times New Roman"/>
-          <w:b/>
-          <w:bCs/>
-          <w:sz w:val="24"/>
-          <w:szCs w:val="24"/>
-          <w:lang w:val="sv-SE"/>
-        </w:rPr>
-        <w:t>Pan-WD/AI</w:t>
-      </w:r>
-      <w:r>
-        <w:rPr>
-          <w:rFonts w:ascii="Times New Roman" w:hAnsi="Times New Roman" w:cs="Times New Roman"/>
-          <w:b/>
-          <w:bCs/>
-          <w:sz w:val="24"/>
-          <w:szCs w:val="24"/>
-          <w:lang w:val="sv-SE"/>
-        </w:rPr>
-        <w:t>/VI/2026</w:t>
+        <w:t>002/UND/PSB/PP-AI/VI/2026</w:t>
       </w:r>
     </w:p>
     <w:p>
@@ -4360,51 +4217,7 @@
           <w:szCs w:val="24"/>
           <w:lang w:val="sv-SE"/>
         </w:rPr>
-        <w:t>0</w:t>
-      </w:r>
-      <w:r>
-        <w:rPr>
-          <w:rFonts w:ascii="Times New Roman" w:hAnsi="Times New Roman" w:cs="Times New Roman"/>
-          <w:b/>
-          <w:bCs/>
-          <w:sz w:val="24"/>
-          <w:szCs w:val="24"/>
-          <w:lang w:val="sv-SE"/>
-        </w:rPr>
-        <w:t>03</w:t>
-      </w:r>
-      <w:r>
-        <w:rPr>
-          <w:rFonts w:ascii="Times New Roman" w:hAnsi="Times New Roman" w:cs="Times New Roman"/>
-          <w:b/>
-          <w:bCs/>
-          <w:sz w:val="24"/>
-          <w:szCs w:val="24"/>
-          <w:lang w:val="sv-SE"/>
-        </w:rPr>
-        <w:t>/</w:t>
-      </w:r>
-      <w:r>
-        <w:rPr>
-          <w:rFonts w:ascii="Times New Roman" w:hAnsi="Times New Roman" w:cs="Times New Roman"/>
-          <w:b/>
-          <w:bCs/>
-          <w:sz w:val="24"/>
-          <w:szCs w:val="24"/>
-          <w:lang w:val="sv-SE"/>
-        </w:rPr>
-        <w:t>Pan-WD/AI</w:t>
-      </w:r>
-      <w:r>
-        <w:rPr>
-          <w:rFonts w:ascii="Times New Roman" w:hAnsi="Times New Roman" w:cs="Times New Roman"/>
-          <w:b/>
-          <w:bCs/>
-          <w:sz w:val="24"/>
-          <w:szCs w:val="24"/>
-          <w:lang w:val="sv-SE"/>
-        </w:rPr>
-        <w:t>/VI/2026</w:t>
+        <w:t>002/UND/PSB/PP-AI/VI/2026</w:t>
       </w:r>
     </w:p>
     <w:p>
@@ -5132,25 +4945,7 @@
           <w:sz w:val="24"/>
           <w:szCs w:val="24"/>
         </w:rPr>
-        <w:t>Al Imam Al Islami</w:t>
-      </w:r>
-      <w:r>
-        <w:rPr>
-          <w:rFonts w:asciiTheme="majorBidi" w:hAnsiTheme="majorBidi" w:cstheme="majorBidi"/>
-          <w:color w:val="000000" w:themeColor="text1"/>
-          <w:sz w:val="24"/>
-          <w:szCs w:val="24"/>
-        </w:rPr>
-        <w:t xml:space="preserve"> Managed by Al Andalus</w:t>
-      </w:r>
-      <w:r>
-        <w:rPr>
-          <w:rFonts w:asciiTheme="majorBidi" w:hAnsiTheme="majorBidi" w:cstheme="majorBidi"/>
-          <w:color w:val="000000" w:themeColor="text1"/>
-          <w:sz w:val="24"/>
-          <w:szCs w:val="24"/>
-        </w:rPr>
-        <w:t>.</w:t>
+        <w:t>Al Imam Al Islami Managed by Al Andalus.</w:t>
       </w:r>
     </w:p>
     <w:p>
@@ -5763,51 +5558,7 @@
           <w:szCs w:val="24"/>
           <w:lang w:val="sv-SE"/>
         </w:rPr>
-        <w:t>0</w:t>
-      </w:r>
-      <w:r>
-        <w:rPr>
-          <w:rFonts w:ascii="Times New Roman" w:hAnsi="Times New Roman" w:cs="Times New Roman"/>
-          <w:b/>
-          <w:bCs/>
-          <w:sz w:val="24"/>
-          <w:szCs w:val="24"/>
-          <w:lang w:val="sv-SE"/>
-        </w:rPr>
-        <w:t>03</w:t>
-      </w:r>
-      <w:r>
-        <w:rPr>
-          <w:rFonts w:ascii="Times New Roman" w:hAnsi="Times New Roman" w:cs="Times New Roman"/>
-          <w:b/>
-          <w:bCs/>
-          <w:sz w:val="24"/>
-          <w:szCs w:val="24"/>
-          <w:lang w:val="sv-SE"/>
-        </w:rPr>
-        <w:t>/</w:t>
-      </w:r>
-      <w:r>
-        <w:rPr>
-          <w:rFonts w:ascii="Times New Roman" w:hAnsi="Times New Roman" w:cs="Times New Roman"/>
-          <w:b/>
-          <w:bCs/>
-          <w:sz w:val="24"/>
-          <w:szCs w:val="24"/>
-          <w:lang w:val="sv-SE"/>
-        </w:rPr>
-        <w:t>Pan-WD/AI</w:t>
-      </w:r>
-      <w:r>
-        <w:rPr>
-          <w:rFonts w:ascii="Times New Roman" w:hAnsi="Times New Roman" w:cs="Times New Roman"/>
-          <w:b/>
-          <w:bCs/>
-          <w:sz w:val="24"/>
-          <w:szCs w:val="24"/>
-          <w:lang w:val="sv-SE"/>
-        </w:rPr>
-        <w:t>/VI/2026</w:t>
+        <w:t>002/UND/PSB/PP-AI/VI/2026</w:t>
       </w:r>
     </w:p>
     <w:p>
@@ -7158,51 +6909,7 @@
           <w:szCs w:val="24"/>
           <w:lang w:val="sv-SE"/>
         </w:rPr>
-        <w:t>0</w:t>
-      </w:r>
-      <w:r>
-        <w:rPr>
-          <w:rFonts w:ascii="Times New Roman" w:hAnsi="Times New Roman" w:cs="Times New Roman"/>
-          <w:b/>
-          <w:bCs/>
-          <w:sz w:val="24"/>
-          <w:szCs w:val="24"/>
-          <w:lang w:val="sv-SE"/>
-        </w:rPr>
-        <w:t>03</w:t>
-      </w:r>
-      <w:r>
-        <w:rPr>
-          <w:rFonts w:ascii="Times New Roman" w:hAnsi="Times New Roman" w:cs="Times New Roman"/>
-          <w:b/>
-          <w:bCs/>
-          <w:sz w:val="24"/>
-          <w:szCs w:val="24"/>
-          <w:lang w:val="sv-SE"/>
-        </w:rPr>
-        <w:t>/</w:t>
-      </w:r>
-      <w:r>
-        <w:rPr>
-          <w:rFonts w:ascii="Times New Roman" w:hAnsi="Times New Roman" w:cs="Times New Roman"/>
-          <w:b/>
-          <w:bCs/>
-          <w:sz w:val="24"/>
-          <w:szCs w:val="24"/>
-          <w:lang w:val="sv-SE"/>
-        </w:rPr>
-        <w:t>Pan-WD/AI</w:t>
-      </w:r>
-      <w:r>
-        <w:rPr>
-          <w:rFonts w:ascii="Times New Roman" w:hAnsi="Times New Roman" w:cs="Times New Roman"/>
-          <w:b/>
-          <w:bCs/>
-          <w:sz w:val="24"/>
-          <w:szCs w:val="24"/>
-          <w:lang w:val="sv-SE"/>
-        </w:rPr>
-        <w:t>/VI/2026</w:t>
+        <w:t>002/UND/PSB/PP-AI/VI/2026</w:t>
       </w:r>
     </w:p>
     <w:p>
@@ -8543,51 +8250,7 @@
           <w:szCs w:val="24"/>
           <w:lang w:val="sv-SE"/>
         </w:rPr>
-        <w:t>0</w:t>
-      </w:r>
-      <w:r>
-        <w:rPr>
-          <w:rFonts w:ascii="Times New Roman" w:hAnsi="Times New Roman" w:cs="Times New Roman"/>
-          <w:b/>
-          <w:bCs/>
-          <w:sz w:val="24"/>
-          <w:szCs w:val="24"/>
-          <w:lang w:val="sv-SE"/>
-        </w:rPr>
-        <w:t>03</w:t>
-      </w:r>
-      <w:r>
-        <w:rPr>
-          <w:rFonts w:ascii="Times New Roman" w:hAnsi="Times New Roman" w:cs="Times New Roman"/>
-          <w:b/>
-          <w:bCs/>
-          <w:sz w:val="24"/>
-          <w:szCs w:val="24"/>
-          <w:lang w:val="sv-SE"/>
-        </w:rPr>
-        <w:t>/</w:t>
-      </w:r>
-      <w:r>
-        <w:rPr>
-          <w:rFonts w:ascii="Times New Roman" w:hAnsi="Times New Roman" w:cs="Times New Roman"/>
-          <w:b/>
-          <w:bCs/>
-          <w:sz w:val="24"/>
-          <w:szCs w:val="24"/>
-          <w:lang w:val="sv-SE"/>
-        </w:rPr>
-        <w:t>Pan-WD/AI</w:t>
-      </w:r>
-      <w:r>
-        <w:rPr>
-          <w:rFonts w:ascii="Times New Roman" w:hAnsi="Times New Roman" w:cs="Times New Roman"/>
-          <w:b/>
-          <w:bCs/>
-          <w:sz w:val="24"/>
-          <w:szCs w:val="24"/>
-          <w:lang w:val="sv-SE"/>
-        </w:rPr>
-        <w:t>/VI/2026</w:t>
+        <w:t>002/UND/PSB/PP-AI/VI/2026</w:t>
       </w:r>
     </w:p>
     <w:p>
@@ -9918,51 +9581,7 @@
           <w:szCs w:val="24"/>
           <w:lang w:val="sv-SE"/>
         </w:rPr>
-        <w:t>0</w:t>
-      </w:r>
-      <w:r>
-        <w:rPr>
-          <w:rFonts w:ascii="Times New Roman" w:hAnsi="Times New Roman" w:cs="Times New Roman"/>
-          <w:b/>
-          <w:bCs/>
-          <w:sz w:val="24"/>
-          <w:szCs w:val="24"/>
-          <w:lang w:val="sv-SE"/>
-        </w:rPr>
-        <w:t>03</w:t>
-      </w:r>
-      <w:r>
-        <w:rPr>
-          <w:rFonts w:ascii="Times New Roman" w:hAnsi="Times New Roman" w:cs="Times New Roman"/>
-          <w:b/>
-          <w:bCs/>
-          <w:sz w:val="24"/>
-          <w:szCs w:val="24"/>
-          <w:lang w:val="sv-SE"/>
-        </w:rPr>
-        <w:t>/</w:t>
-      </w:r>
-      <w:r>
-        <w:rPr>
-          <w:rFonts w:ascii="Times New Roman" w:hAnsi="Times New Roman" w:cs="Times New Roman"/>
-          <w:b/>
-          <w:bCs/>
-          <w:sz w:val="24"/>
-          <w:szCs w:val="24"/>
-          <w:lang w:val="sv-SE"/>
-        </w:rPr>
-        <w:t>Pan-WD/AI</w:t>
-      </w:r>
-      <w:r>
-        <w:rPr>
-          <w:rFonts w:ascii="Times New Roman" w:hAnsi="Times New Roman" w:cs="Times New Roman"/>
-          <w:b/>
-          <w:bCs/>
-          <w:sz w:val="24"/>
-          <w:szCs w:val="24"/>
-          <w:lang w:val="sv-SE"/>
-        </w:rPr>
-        <w:t>/VI/2026</w:t>
+        <w:t>002/UND/PSB/PP-AI/VI/2026</w:t>
       </w:r>
     </w:p>
     <w:p>
@@ -11313,51 +10932,7 @@
           <w:szCs w:val="24"/>
           <w:lang w:val="sv-SE"/>
         </w:rPr>
-        <w:t>0</w:t>
-      </w:r>
-      <w:r>
-        <w:rPr>
-          <w:rFonts w:ascii="Times New Roman" w:hAnsi="Times New Roman" w:cs="Times New Roman"/>
-          <w:b/>
-          <w:bCs/>
-          <w:sz w:val="24"/>
-          <w:szCs w:val="24"/>
-          <w:lang w:val="sv-SE"/>
-        </w:rPr>
-        <w:t>03</w:t>
-      </w:r>
-      <w:r>
-        <w:rPr>
-          <w:rFonts w:ascii="Times New Roman" w:hAnsi="Times New Roman" w:cs="Times New Roman"/>
-          <w:b/>
-          <w:bCs/>
-          <w:sz w:val="24"/>
-          <w:szCs w:val="24"/>
-          <w:lang w:val="sv-SE"/>
-        </w:rPr>
-        <w:t>/</w:t>
-      </w:r>
-      <w:r>
-        <w:rPr>
-          <w:rFonts w:ascii="Times New Roman" w:hAnsi="Times New Roman" w:cs="Times New Roman"/>
-          <w:b/>
-          <w:bCs/>
-          <w:sz w:val="24"/>
-          <w:szCs w:val="24"/>
-          <w:lang w:val="sv-SE"/>
-        </w:rPr>
-        <w:t>Pan-WD/AI</w:t>
-      </w:r>
-      <w:r>
-        <w:rPr>
-          <w:rFonts w:ascii="Times New Roman" w:hAnsi="Times New Roman" w:cs="Times New Roman"/>
-          <w:b/>
-          <w:bCs/>
-          <w:sz w:val="24"/>
-          <w:szCs w:val="24"/>
-          <w:lang w:val="sv-SE"/>
-        </w:rPr>
-        <w:t>/VI/2026</w:t>
+        <w:t>002/UND/PSB/PP-AI/VI/2026</w:t>
       </w:r>
     </w:p>
     <w:p>
@@ -12698,51 +12273,7 @@
           <w:szCs w:val="24"/>
           <w:lang w:val="sv-SE"/>
         </w:rPr>
-        <w:t>0</w:t>
-      </w:r>
-      <w:r>
-        <w:rPr>
-          <w:rFonts w:ascii="Times New Roman" w:hAnsi="Times New Roman" w:cs="Times New Roman"/>
-          <w:b/>
-          <w:bCs/>
-          <w:sz w:val="24"/>
-          <w:szCs w:val="24"/>
-          <w:lang w:val="sv-SE"/>
-        </w:rPr>
-        <w:t>03</w:t>
-      </w:r>
-      <w:r>
-        <w:rPr>
-          <w:rFonts w:ascii="Times New Roman" w:hAnsi="Times New Roman" w:cs="Times New Roman"/>
-          <w:b/>
-          <w:bCs/>
-          <w:sz w:val="24"/>
-          <w:szCs w:val="24"/>
-          <w:lang w:val="sv-SE"/>
-        </w:rPr>
-        <w:t>/</w:t>
-      </w:r>
-      <w:r>
-        <w:rPr>
-          <w:rFonts w:ascii="Times New Roman" w:hAnsi="Times New Roman" w:cs="Times New Roman"/>
-          <w:b/>
-          <w:bCs/>
-          <w:sz w:val="24"/>
-          <w:szCs w:val="24"/>
-          <w:lang w:val="sv-SE"/>
-        </w:rPr>
-        <w:t>Pan-WD/AI</w:t>
-      </w:r>
-      <w:r>
-        <w:rPr>
-          <w:rFonts w:ascii="Times New Roman" w:hAnsi="Times New Roman" w:cs="Times New Roman"/>
-          <w:b/>
-          <w:bCs/>
-          <w:sz w:val="24"/>
-          <w:szCs w:val="24"/>
-          <w:lang w:val="sv-SE"/>
-        </w:rPr>
-        <w:t>/VI/2026</w:t>
+        <w:t>002/UND/PSB/PP-AI/VI/2026</w:t>
       </w:r>
     </w:p>
     <w:p>
@@ -14101,51 +13632,7 @@
           <w:szCs w:val="24"/>
           <w:lang w:val="sv-SE"/>
         </w:rPr>
-        <w:t>0</w:t>
-      </w:r>
-      <w:r>
-        <w:rPr>
-          <w:rFonts w:ascii="Times New Roman" w:hAnsi="Times New Roman" w:cs="Times New Roman"/>
-          <w:b/>
-          <w:bCs/>
-          <w:sz w:val="24"/>
-          <w:szCs w:val="24"/>
-          <w:lang w:val="sv-SE"/>
-        </w:rPr>
-        <w:t>03</w:t>
-      </w:r>
-      <w:r>
-        <w:rPr>
-          <w:rFonts w:ascii="Times New Roman" w:hAnsi="Times New Roman" w:cs="Times New Roman"/>
-          <w:b/>
-          <w:bCs/>
-          <w:sz w:val="24"/>
-          <w:szCs w:val="24"/>
-          <w:lang w:val="sv-SE"/>
-        </w:rPr>
-        <w:t>/</w:t>
-      </w:r>
-      <w:r>
-        <w:rPr>
-          <w:rFonts w:ascii="Times New Roman" w:hAnsi="Times New Roman" w:cs="Times New Roman"/>
-          <w:b/>
-          <w:bCs/>
-          <w:sz w:val="24"/>
-          <w:szCs w:val="24"/>
-          <w:lang w:val="sv-SE"/>
-        </w:rPr>
-        <w:t>Pan-WD/AI</w:t>
-      </w:r>
-      <w:r>
-        <w:rPr>
-          <w:rFonts w:ascii="Times New Roman" w:hAnsi="Times New Roman" w:cs="Times New Roman"/>
-          <w:b/>
-          <w:bCs/>
-          <w:sz w:val="24"/>
-          <w:szCs w:val="24"/>
-          <w:lang w:val="sv-SE"/>
-        </w:rPr>
-        <w:t>/VI/2026</w:t>
+        <w:t>002/UND/PSB/PP-AI/VI/2026</w:t>
       </w:r>
     </w:p>
     <w:p>
@@ -15496,51 +14983,7 @@
           <w:szCs w:val="24"/>
           <w:lang w:val="sv-SE"/>
         </w:rPr>
-        <w:t>0</w:t>
-      </w:r>
-      <w:r>
-        <w:rPr>
-          <w:rFonts w:ascii="Times New Roman" w:hAnsi="Times New Roman" w:cs="Times New Roman"/>
-          <w:b/>
-          <w:bCs/>
-          <w:sz w:val="24"/>
-          <w:szCs w:val="24"/>
-          <w:lang w:val="sv-SE"/>
-        </w:rPr>
-        <w:t>03</w:t>
-      </w:r>
-      <w:r>
-        <w:rPr>
-          <w:rFonts w:ascii="Times New Roman" w:hAnsi="Times New Roman" w:cs="Times New Roman"/>
-          <w:b/>
-          <w:bCs/>
-          <w:sz w:val="24"/>
-          <w:szCs w:val="24"/>
-          <w:lang w:val="sv-SE"/>
-        </w:rPr>
-        <w:t>/</w:t>
-      </w:r>
-      <w:r>
-        <w:rPr>
-          <w:rFonts w:ascii="Times New Roman" w:hAnsi="Times New Roman" w:cs="Times New Roman"/>
-          <w:b/>
-          <w:bCs/>
-          <w:sz w:val="24"/>
-          <w:szCs w:val="24"/>
-          <w:lang w:val="sv-SE"/>
-        </w:rPr>
-        <w:t>Pan-WD/AI</w:t>
-      </w:r>
-      <w:r>
-        <w:rPr>
-          <w:rFonts w:ascii="Times New Roman" w:hAnsi="Times New Roman" w:cs="Times New Roman"/>
-          <w:b/>
-          <w:bCs/>
-          <w:sz w:val="24"/>
-          <w:szCs w:val="24"/>
-          <w:lang w:val="sv-SE"/>
-        </w:rPr>
-        <w:t>/VI/2026</w:t>
+        <w:t>002/UND/PSB/PP-AI/VI/2026</w:t>
       </w:r>
     </w:p>
     <w:p>
@@ -16891,51 +16334,7 @@
           <w:szCs w:val="24"/>
           <w:lang w:val="sv-SE"/>
         </w:rPr>
-        <w:t>0</w:t>
-      </w:r>
-      <w:r>
-        <w:rPr>
-          <w:rFonts w:ascii="Times New Roman" w:hAnsi="Times New Roman" w:cs="Times New Roman"/>
-          <w:b/>
-          <w:bCs/>
-          <w:sz w:val="24"/>
-          <w:szCs w:val="24"/>
-          <w:lang w:val="sv-SE"/>
-        </w:rPr>
-        <w:t>03</w:t>
-      </w:r>
-      <w:r>
-        <w:rPr>
-          <w:rFonts w:ascii="Times New Roman" w:hAnsi="Times New Roman" w:cs="Times New Roman"/>
-          <w:b/>
-          <w:bCs/>
-          <w:sz w:val="24"/>
-          <w:szCs w:val="24"/>
-          <w:lang w:val="sv-SE"/>
-        </w:rPr>
-        <w:t>/</w:t>
-      </w:r>
-      <w:r>
-        <w:rPr>
-          <w:rFonts w:ascii="Times New Roman" w:hAnsi="Times New Roman" w:cs="Times New Roman"/>
-          <w:b/>
-          <w:bCs/>
-          <w:sz w:val="24"/>
-          <w:szCs w:val="24"/>
-          <w:lang w:val="sv-SE"/>
-        </w:rPr>
-        <w:t>Pan-WD/AI</w:t>
-      </w:r>
-      <w:r>
-        <w:rPr>
-          <w:rFonts w:ascii="Times New Roman" w:hAnsi="Times New Roman" w:cs="Times New Roman"/>
-          <w:b/>
-          <w:bCs/>
-          <w:sz w:val="24"/>
-          <w:szCs w:val="24"/>
-          <w:lang w:val="sv-SE"/>
-        </w:rPr>
-        <w:t>/VI/2026</w:t>
+        <w:t>002/UND/PSB/PP-AI/VI/2026</w:t>
       </w:r>
     </w:p>
     <w:p>
@@ -18276,51 +17675,7 @@
           <w:szCs w:val="24"/>
           <w:lang w:val="sv-SE"/>
         </w:rPr>
-        <w:t>0</w:t>
-      </w:r>
-      <w:r>
-        <w:rPr>
-          <w:rFonts w:ascii="Times New Roman" w:hAnsi="Times New Roman" w:cs="Times New Roman"/>
-          <w:b/>
-          <w:bCs/>
-          <w:sz w:val="24"/>
-          <w:szCs w:val="24"/>
-          <w:lang w:val="sv-SE"/>
-        </w:rPr>
-        <w:t>03</w:t>
-      </w:r>
-      <w:r>
-        <w:rPr>
-          <w:rFonts w:ascii="Times New Roman" w:hAnsi="Times New Roman" w:cs="Times New Roman"/>
-          <w:b/>
-          <w:bCs/>
-          <w:sz w:val="24"/>
-          <w:szCs w:val="24"/>
-          <w:lang w:val="sv-SE"/>
-        </w:rPr>
-        <w:t>/</w:t>
-      </w:r>
-      <w:r>
-        <w:rPr>
-          <w:rFonts w:ascii="Times New Roman" w:hAnsi="Times New Roman" w:cs="Times New Roman"/>
-          <w:b/>
-          <w:bCs/>
-          <w:sz w:val="24"/>
-          <w:szCs w:val="24"/>
-          <w:lang w:val="sv-SE"/>
-        </w:rPr>
-        <w:t>Pan-WD/AI</w:t>
-      </w:r>
-      <w:r>
-        <w:rPr>
-          <w:rFonts w:ascii="Times New Roman" w:hAnsi="Times New Roman" w:cs="Times New Roman"/>
-          <w:b/>
-          <w:bCs/>
-          <w:sz w:val="24"/>
-          <w:szCs w:val="24"/>
-          <w:lang w:val="sv-SE"/>
-        </w:rPr>
-        <w:t>/VI/2026</w:t>
+        <w:t>002/UND/PSB/PP-AI/VI/2026</w:t>
       </w:r>
     </w:p>
     <w:p>
@@ -19098,16 +18453,7 @@
           <w:szCs w:val="24"/>
           <w:lang w:eastAsia="en-ID"/>
         </w:rPr>
-        <w:t>Ibu</w:t>
-      </w:r>
-      <w:r>
-        <w:rPr>
-          <w:rFonts w:ascii="Times New Roman" w:eastAsia="Times New Roman" w:hAnsi="Times New Roman" w:cs="Times New Roman"/>
-          <w:sz w:val="24"/>
-          <w:szCs w:val="24"/>
-          <w:lang w:eastAsia="en-ID"/>
-        </w:rPr>
-        <w:t xml:space="preserve"> </w:t>
+        <w:t xml:space="preserve">Ibu </w:t>
       </w:r>
       <w:r>
         <w:rPr>
@@ -19678,51 +19024,7 @@
           <w:szCs w:val="24"/>
           <w:lang w:val="sv-SE"/>
         </w:rPr>
-        <w:t>0</w:t>
-      </w:r>
-      <w:r>
-        <w:rPr>
-          <w:rFonts w:ascii="Times New Roman" w:hAnsi="Times New Roman" w:cs="Times New Roman"/>
-          <w:b/>
-          <w:bCs/>
-          <w:sz w:val="24"/>
-          <w:szCs w:val="24"/>
-          <w:lang w:val="sv-SE"/>
-        </w:rPr>
-        <w:t>03</w:t>
-      </w:r>
-      <w:r>
-        <w:rPr>
-          <w:rFonts w:ascii="Times New Roman" w:hAnsi="Times New Roman" w:cs="Times New Roman"/>
-          <w:b/>
-          <w:bCs/>
-          <w:sz w:val="24"/>
-          <w:szCs w:val="24"/>
-          <w:lang w:val="sv-SE"/>
-        </w:rPr>
-        <w:t>/</w:t>
-      </w:r>
-      <w:r>
-        <w:rPr>
-          <w:rFonts w:ascii="Times New Roman" w:hAnsi="Times New Roman" w:cs="Times New Roman"/>
-          <w:b/>
-          <w:bCs/>
-          <w:sz w:val="24"/>
-          <w:szCs w:val="24"/>
-          <w:lang w:val="sv-SE"/>
-        </w:rPr>
-        <w:t>Pan-WD/AI</w:t>
-      </w:r>
-      <w:r>
-        <w:rPr>
-          <w:rFonts w:ascii="Times New Roman" w:hAnsi="Times New Roman" w:cs="Times New Roman"/>
-          <w:b/>
-          <w:bCs/>
-          <w:sz w:val="24"/>
-          <w:szCs w:val="24"/>
-          <w:lang w:val="sv-SE"/>
-        </w:rPr>
-        <w:t>/VI/2026</w:t>
+        <w:t>002/UND/PSB/PP-AI/VI/2026</w:t>
       </w:r>
     </w:p>
     <w:p>
@@ -21073,51 +20375,7 @@
           <w:szCs w:val="24"/>
           <w:lang w:val="sv-SE"/>
         </w:rPr>
-        <w:t>0</w:t>
-      </w:r>
-      <w:r>
-        <w:rPr>
-          <w:rFonts w:ascii="Times New Roman" w:hAnsi="Times New Roman" w:cs="Times New Roman"/>
-          <w:b/>
-          <w:bCs/>
-          <w:sz w:val="24"/>
-          <w:szCs w:val="24"/>
-          <w:lang w:val="sv-SE"/>
-        </w:rPr>
-        <w:t>03</w:t>
-      </w:r>
-      <w:r>
-        <w:rPr>
-          <w:rFonts w:ascii="Times New Roman" w:hAnsi="Times New Roman" w:cs="Times New Roman"/>
-          <w:b/>
-          <w:bCs/>
-          <w:sz w:val="24"/>
-          <w:szCs w:val="24"/>
-          <w:lang w:val="sv-SE"/>
-        </w:rPr>
-        <w:t>/</w:t>
-      </w:r>
-      <w:r>
-        <w:rPr>
-          <w:rFonts w:ascii="Times New Roman" w:hAnsi="Times New Roman" w:cs="Times New Roman"/>
-          <w:b/>
-          <w:bCs/>
-          <w:sz w:val="24"/>
-          <w:szCs w:val="24"/>
-          <w:lang w:val="sv-SE"/>
-        </w:rPr>
-        <w:t>Pan-WD/AI</w:t>
-      </w:r>
-      <w:r>
-        <w:rPr>
-          <w:rFonts w:ascii="Times New Roman" w:hAnsi="Times New Roman" w:cs="Times New Roman"/>
-          <w:b/>
-          <w:bCs/>
-          <w:sz w:val="24"/>
-          <w:szCs w:val="24"/>
-          <w:lang w:val="sv-SE"/>
-        </w:rPr>
-        <w:t>/VI/2026</w:t>
+        <w:t>002/UND/PSB/PP-AI/VI/2026</w:t>
       </w:r>
     </w:p>
     <w:p>
@@ -22401,51 +21659,7 @@
           <w:szCs w:val="24"/>
           <w:lang w:val="sv-SE"/>
         </w:rPr>
-        <w:t>0</w:t>
-      </w:r>
-      <w:r>
-        <w:rPr>
-          <w:rFonts w:ascii="Times New Roman" w:hAnsi="Times New Roman" w:cs="Times New Roman"/>
-          <w:b/>
-          <w:bCs/>
-          <w:sz w:val="24"/>
-          <w:szCs w:val="24"/>
-          <w:lang w:val="sv-SE"/>
-        </w:rPr>
-        <w:t>03</w:t>
-      </w:r>
-      <w:r>
-        <w:rPr>
-          <w:rFonts w:ascii="Times New Roman" w:hAnsi="Times New Roman" w:cs="Times New Roman"/>
-          <w:b/>
-          <w:bCs/>
-          <w:sz w:val="24"/>
-          <w:szCs w:val="24"/>
-          <w:lang w:val="sv-SE"/>
-        </w:rPr>
-        <w:t>/</w:t>
-      </w:r>
-      <w:r>
-        <w:rPr>
-          <w:rFonts w:ascii="Times New Roman" w:hAnsi="Times New Roman" w:cs="Times New Roman"/>
-          <w:b/>
-          <w:bCs/>
-          <w:sz w:val="24"/>
-          <w:szCs w:val="24"/>
-          <w:lang w:val="sv-SE"/>
-        </w:rPr>
-        <w:t>Pan-WD/AI</w:t>
-      </w:r>
-      <w:r>
-        <w:rPr>
-          <w:rFonts w:ascii="Times New Roman" w:hAnsi="Times New Roman" w:cs="Times New Roman"/>
-          <w:b/>
-          <w:bCs/>
-          <w:sz w:val="24"/>
-          <w:szCs w:val="24"/>
-          <w:lang w:val="sv-SE"/>
-        </w:rPr>
-        <w:t>/VI/2026</w:t>
+        <w:t>002/UND/PSB/PP-AI/VI/2026</w:t>
       </w:r>
     </w:p>
     <w:p>
@@ -23235,16 +22449,7 @@
           <w:szCs w:val="24"/>
           <w:lang w:eastAsia="en-ID"/>
         </w:rPr>
-        <w:t>Ustadz</w:t>
-      </w:r>
-      <w:r>
-        <w:rPr>
-          <w:rFonts w:ascii="Times New Roman" w:eastAsia="Times New Roman" w:hAnsi="Times New Roman" w:cs="Times New Roman"/>
-          <w:sz w:val="24"/>
-          <w:szCs w:val="24"/>
-          <w:lang w:eastAsia="en-ID"/>
-        </w:rPr>
-        <w:t xml:space="preserve"> </w:t>
+        <w:t xml:space="preserve">Ustadz </w:t>
       </w:r>
       <w:r>
         <w:rPr>
@@ -23815,51 +23020,7 @@
           <w:szCs w:val="24"/>
           <w:lang w:val="sv-SE"/>
         </w:rPr>
-        <w:t>0</w:t>
-      </w:r>
-      <w:r>
-        <w:rPr>
-          <w:rFonts w:ascii="Times New Roman" w:hAnsi="Times New Roman" w:cs="Times New Roman"/>
-          <w:b/>
-          <w:bCs/>
-          <w:sz w:val="24"/>
-          <w:szCs w:val="24"/>
-          <w:lang w:val="sv-SE"/>
-        </w:rPr>
-        <w:t>03</w:t>
-      </w:r>
-      <w:r>
-        <w:rPr>
-          <w:rFonts w:ascii="Times New Roman" w:hAnsi="Times New Roman" w:cs="Times New Roman"/>
-          <w:b/>
-          <w:bCs/>
-          <w:sz w:val="24"/>
-          <w:szCs w:val="24"/>
-          <w:lang w:val="sv-SE"/>
-        </w:rPr>
-        <w:t>/</w:t>
-      </w:r>
-      <w:r>
-        <w:rPr>
-          <w:rFonts w:ascii="Times New Roman" w:hAnsi="Times New Roman" w:cs="Times New Roman"/>
-          <w:b/>
-          <w:bCs/>
-          <w:sz w:val="24"/>
-          <w:szCs w:val="24"/>
-          <w:lang w:val="sv-SE"/>
-        </w:rPr>
-        <w:t>Pan-WD/AI</w:t>
-      </w:r>
-      <w:r>
-        <w:rPr>
-          <w:rFonts w:ascii="Times New Roman" w:hAnsi="Times New Roman" w:cs="Times New Roman"/>
-          <w:b/>
-          <w:bCs/>
-          <w:sz w:val="24"/>
-          <w:szCs w:val="24"/>
-          <w:lang w:val="sv-SE"/>
-        </w:rPr>
-        <w:t>/VI/2026</w:t>
+        <w:t>002/UND/PSB/PP-AI/VI/2026</w:t>
       </w:r>
     </w:p>
     <w:p>
@@ -25156,7 +24317,7 @@
 </file>
 
 <file path=word/endnotes.xml><?xml version="1.0" encoding="utf-8"?>
-<w:endnotes xmlns:wpc="http://schemas.microsoft.com/office/word/2010/wordprocessingCanvas" xmlns:cx="http://schemas.microsoft.com/office/drawing/2014/chartex" xmlns:cx1="http://schemas.microsoft.com/office/drawing/2015/9/8/chartex" xmlns:cx2="http://schemas.microsoft.com/office/drawing/2015/10/21/chartex" xmlns:cx3="http://schemas.microsoft.com/office/drawing/2016/5/9/chartex" xmlns:cx4="http://schemas.microsoft.com/office/drawing/2016/5/10/chartex" xmlns:cx5="http://schemas.microsoft.com/office/drawing/2016/5/11/chartex" xmlns:cx6="http://schemas.microsoft.com/office/drawing/2016/5/12/chartex" xmlns:cx7="http://schemas.microsoft.com/office/drawing/2016/5/13/chartex" xmlns:cx8="http://schemas.microsoft.com/office/drawing/2016/5/14/chartex" xmlns:mc="http://schemas.openxmlformats.org/markup-compatibility/2006" xmlns:aink="http://schemas.microsoft.com/office/drawing/2016/ink" xmlns:am3d="http://schemas.microsoft.com/office/drawing/2017/model3d" xmlns:o="urn:schemas-microsoft-com:office:office" xmlns:oel="http://schemas.microsoft.com/office/2019/extlst" xmlns:r="http://schemas.openxmlformats.org/officeDocument/2006/relationships" xmlns:m="http://schemas.openxmlformats.org/officeDocument/2006/math" xmlns:v="urn:schemas-microsoft-com:vml" xmlns:wp14="http://schemas.microsoft.com/office/word/2010/wordprocessingDrawing" xmlns:wp="http://schemas.openxmlformats.org/drawingml/2006/wordprocessingDrawing" xmlns:w10="urn:schemas-microsoft-com:office:word" xmlns:w="http://schemas.openxmlformats.org/wordprocessingml/2006/main" xmlns:w14="http://schemas.microsoft.com/office/word/2010/wordml" xmlns:w15="http://schemas.microsoft.com/office/word/2012/wordml" xmlns:w16cex="http://schemas.microsoft.com/office/word/2018/wordml/cex" xmlns:w16cid="http://schemas.microsoft.com/office/word/2016/wordml/cid" xmlns:w16="http://schemas.microsoft.com/office/word/2018/wordml" xmlns:w16du="http://schemas.microsoft.com/office/word/2023/wordml/word16du" xmlns:w16sdtdh="http://schemas.microsoft.com/office/word/2020/wordml/sdtdatahash" xmlns:w16sdtfl="http://schemas.microsoft.com/office/word/2024/wordml/sdtformatlock" xmlns:w16se="http://schemas.microsoft.com/office/word/2015/wordml/symex" xmlns:wpg="http://schemas.microsoft.com/office/word/2010/wordprocessingGroup" xmlns:wpi="http://schemas.microsoft.com/office/word/2010/wordprocessingInk" xmlns:wne="http://schemas.microsoft.com/office/word/2006/wordml" xmlns:wps="http://schemas.microsoft.com/office/word/2010/wordprocessingShape" mc:Ignorable="w14 w15 w16se w16cid w16 w16cex w16sdtdh w16sdtfl w16du wp14">
+<w:endnotes xmlns:wpc="http://schemas.microsoft.com/office/word/2010/wordprocessingCanvas" xmlns:cx="http://schemas.microsoft.com/office/drawing/2014/chartex" xmlns:cx1="http://schemas.microsoft.com/office/drawing/2015/9/8/chartex" xmlns:cx2="http://schemas.microsoft.com/office/drawing/2015/10/21/chartex" xmlns:cx3="http://schemas.microsoft.com/office/drawing/2016/5/9/chartex" xmlns:cx4="http://schemas.microsoft.com/office/drawing/2016/5/10/chartex" xmlns:cx5="http://schemas.microsoft.com/office/drawing/2016/5/11/chartex" xmlns:cx6="http://schemas.microsoft.com/office/drawing/2016/5/12/chartex" xmlns:cx7="http://schemas.microsoft.com/office/drawing/2016/5/13/chartex" xmlns:cx8="http://schemas.microsoft.com/office/drawing/2016/5/14/chartex" xmlns:mc="http://schemas.openxmlformats.org/markup-compatibility/2006" xmlns:aink="http://schemas.microsoft.com/office/drawing/2016/ink" xmlns:am3d="http://schemas.microsoft.com/office/drawing/2017/model3d" xmlns:o="urn:schemas-microsoft-com:office:office" xmlns:oel="http://schemas.microsoft.com/office/2019/extlst" xmlns:r="http://schemas.openxmlformats.org/officeDocument/2006/relationships" xmlns:m="http://schemas.openxmlformats.org/officeDocument/2006/math" xmlns:v="urn:schemas-microsoft-com:vml" xmlns:wp14="http://schemas.microsoft.com/office/word/2010/wordprocessingDrawing" xmlns:wp="http://schemas.openxmlformats.org/drawingml/2006/wordprocessingDrawing" xmlns:w10="urn:schemas-microsoft-com:office:word" xmlns:w="http://schemas.openxmlformats.org/wordprocessingml/2006/main" xmlns:w14="http://schemas.microsoft.com/office/word/2010/wordml" xmlns:w15="http://schemas.microsoft.com/office/word/2012/wordml" xmlns:w16cex="http://schemas.microsoft.com/office/word/2018/wordml/cex" xmlns:w16cid="http://schemas.microsoft.com/office/word/2016/wordml/cid" xmlns:w16="http://schemas.microsoft.com/office/word/2018/wordml" xmlns:w16sdtdh="http://schemas.microsoft.com/office/word/2020/wordml/sdtdatahash" xmlns:w16se="http://schemas.microsoft.com/office/word/2015/wordml/symex" xmlns:wpg="http://schemas.microsoft.com/office/word/2010/wordprocessingGroup" xmlns:wpi="http://schemas.microsoft.com/office/word/2010/wordprocessingInk" xmlns:wne="http://schemas.microsoft.com/office/word/2006/wordml" xmlns:wps="http://schemas.microsoft.com/office/word/2010/wordprocessingShape" mc:Ignorable="w14 w15 w16se w16cid w16 w16cex w16sdtdh wp14">
   <w:endnote w:type="separator" w:id="-1">
     <w:p>
       <w:pPr>
@@ -25181,7 +24342,7 @@
 </file>
 
 <file path=word/footnotes.xml><?xml version="1.0" encoding="utf-8"?>
-<w:footnotes xmlns:wpc="http://schemas.microsoft.com/office/word/2010/wordprocessingCanvas" xmlns:cx="http://schemas.microsoft.com/office/drawing/2014/chartex" xmlns:cx1="http://schemas.microsoft.com/office/drawing/2015/9/8/chartex" xmlns:cx2="http://schemas.microsoft.com/office/drawing/2015/10/21/chartex" xmlns:cx3="http://schemas.microsoft.com/office/drawing/2016/5/9/chartex" xmlns:cx4="http://schemas.microsoft.com/office/drawing/2016/5/10/chartex" xmlns:cx5="http://schemas.microsoft.com/office/drawing/2016/5/11/chartex" xmlns:cx6="http://schemas.microsoft.com/office/drawing/2016/5/12/chartex" xmlns:cx7="http://schemas.microsoft.com/office/drawing/2016/5/13/chartex" xmlns:cx8="http://schemas.microsoft.com/office/drawing/2016/5/14/chartex" xmlns:mc="http://schemas.openxmlformats.org/markup-compatibility/2006" xmlns:aink="http://schemas.microsoft.com/office/drawing/2016/ink" xmlns:am3d="http://schemas.microsoft.com/office/drawing/2017/model3d" xmlns:o="urn:schemas-microsoft-com:office:office" xmlns:oel="http://schemas.microsoft.com/office/2019/extlst" xmlns:r="http://schemas.openxmlformats.org/officeDocument/2006/relationships" xmlns:m="http://schemas.openxmlformats.org/officeDocument/2006/math" xmlns:v="urn:schemas-microsoft-com:vml" xmlns:wp14="http://schemas.microsoft.com/office/word/2010/wordprocessingDrawing" xmlns:wp="http://schemas.openxmlformats.org/drawingml/2006/wordprocessingDrawing" xmlns:w10="urn:schemas-microsoft-com:office:word" xmlns:w="http://schemas.openxmlformats.org/wordprocessingml/2006/main" xmlns:w14="http://schemas.microsoft.com/office/word/2010/wordml" xmlns:w15="http://schemas.microsoft.com/office/word/2012/wordml" xmlns:w16cex="http://schemas.microsoft.com/office/word/2018/wordml/cex" xmlns:w16cid="http://schemas.microsoft.com/office/word/2016/wordml/cid" xmlns:w16="http://schemas.microsoft.com/office/word/2018/wordml" xmlns:w16du="http://schemas.microsoft.com/office/word/2023/wordml/word16du" xmlns:w16sdtdh="http://schemas.microsoft.com/office/word/2020/wordml/sdtdatahash" xmlns:w16sdtfl="http://schemas.microsoft.com/office/word/2024/wordml/sdtformatlock" xmlns:w16se="http://schemas.microsoft.com/office/word/2015/wordml/symex" xmlns:wpg="http://schemas.microsoft.com/office/word/2010/wordprocessingGroup" xmlns:wpi="http://schemas.microsoft.com/office/word/2010/wordprocessingInk" xmlns:wne="http://schemas.microsoft.com/office/word/2006/wordml" xmlns:wps="http://schemas.microsoft.com/office/word/2010/wordprocessingShape" mc:Ignorable="w14 w15 w16se w16cid w16 w16cex w16sdtdh w16sdtfl w16du wp14">
+<w:footnotes xmlns:wpc="http://schemas.microsoft.com/office/word/2010/wordprocessingCanvas" xmlns:cx="http://schemas.microsoft.com/office/drawing/2014/chartex" xmlns:cx1="http://schemas.microsoft.com/office/drawing/2015/9/8/chartex" xmlns:cx2="http://schemas.microsoft.com/office/drawing/2015/10/21/chartex" xmlns:cx3="http://schemas.microsoft.com/office/drawing/2016/5/9/chartex" xmlns:cx4="http://schemas.microsoft.com/office/drawing/2016/5/10/chartex" xmlns:cx5="http://schemas.microsoft.com/office/drawing/2016/5/11/chartex" xmlns:cx6="http://schemas.microsoft.com/office/drawing/2016/5/12/chartex" xmlns:cx7="http://schemas.microsoft.com/office/drawing/2016/5/13/chartex" xmlns:cx8="http://schemas.microsoft.com/office/drawing/2016/5/14/chartex" xmlns:mc="http://schemas.openxmlformats.org/markup-compatibility/2006" xmlns:aink="http://schemas.microsoft.com/office/drawing/2016/ink" xmlns:am3d="http://schemas.microsoft.com/office/drawing/2017/model3d" xmlns:o="urn:schemas-microsoft-com:office:office" xmlns:oel="http://schemas.microsoft.com/office/2019/extlst" xmlns:r="http://schemas.openxmlformats.org/officeDocument/2006/relationships" xmlns:m="http://schemas.openxmlformats.org/officeDocument/2006/math" xmlns:v="urn:schemas-microsoft-com:vml" xmlns:wp14="http://schemas.microsoft.com/office/word/2010/wordprocessingDrawing" xmlns:wp="http://schemas.openxmlformats.org/drawingml/2006/wordprocessingDrawing" xmlns:w10="urn:schemas-microsoft-com:office:word" xmlns:w="http://schemas.openxmlformats.org/wordprocessingml/2006/main" xmlns:w14="http://schemas.microsoft.com/office/word/2010/wordml" xmlns:w15="http://schemas.microsoft.com/office/word/2012/wordml" xmlns:w16cex="http://schemas.microsoft.com/office/word/2018/wordml/cex" xmlns:w16cid="http://schemas.microsoft.com/office/word/2016/wordml/cid" xmlns:w16="http://schemas.microsoft.com/office/word/2018/wordml" xmlns:w16sdtdh="http://schemas.microsoft.com/office/word/2020/wordml/sdtdatahash" xmlns:w16se="http://schemas.microsoft.com/office/word/2015/wordml/symex" xmlns:wpg="http://schemas.microsoft.com/office/word/2010/wordprocessingGroup" xmlns:wpi="http://schemas.microsoft.com/office/word/2010/wordprocessingInk" xmlns:wne="http://schemas.microsoft.com/office/word/2006/wordml" xmlns:wps="http://schemas.microsoft.com/office/word/2010/wordprocessingShape" mc:Ignorable="w14 w15 w16se w16cid w16 w16cex w16sdtdh wp14">
   <w:footnote w:type="separator" w:id="-1">
     <w:p>
       <w:pPr>
@@ -25206,7 +24367,7 @@
 </file>
 
 <file path=word/header1.xml><?xml version="1.0" encoding="utf-8"?>
-<w:hdr xmlns:wpc="http://schemas.microsoft.com/office/word/2010/wordprocessingCanvas" xmlns:cx="http://schemas.microsoft.com/office/drawing/2014/chartex" xmlns:cx1="http://schemas.microsoft.com/office/drawing/2015/9/8/chartex" xmlns:cx2="http://schemas.microsoft.com/office/drawing/2015/10/21/chartex" xmlns:cx3="http://schemas.microsoft.com/office/drawing/2016/5/9/chartex" xmlns:cx4="http://schemas.microsoft.com/office/drawing/2016/5/10/chartex" xmlns:cx5="http://schemas.microsoft.com/office/drawing/2016/5/11/chartex" xmlns:cx6="http://schemas.microsoft.com/office/drawing/2016/5/12/chartex" xmlns:cx7="http://schemas.microsoft.com/office/drawing/2016/5/13/chartex" xmlns:cx8="http://schemas.microsoft.com/office/drawing/2016/5/14/chartex" xmlns:mc="http://schemas.openxmlformats.org/markup-compatibility/2006" xmlns:aink="http://schemas.microsoft.com/office/drawing/2016/ink" xmlns:am3d="http://schemas.microsoft.com/office/drawing/2017/model3d" xmlns:o="urn:schemas-microsoft-com:office:office" xmlns:oel="http://schemas.microsoft.com/office/2019/extlst" xmlns:r="http://schemas.openxmlformats.org/officeDocument/2006/relationships" xmlns:m="http://schemas.openxmlformats.org/officeDocument/2006/math" xmlns:v="urn:schemas-microsoft-com:vml" xmlns:wp14="http://schemas.microsoft.com/office/word/2010/wordprocessingDrawing" xmlns:wp="http://schemas.openxmlformats.org/drawingml/2006/wordprocessingDrawing" xmlns:w10="urn:schemas-microsoft-com:office:word" xmlns:w="http://schemas.openxmlformats.org/wordprocessingml/2006/main" xmlns:w14="http://schemas.microsoft.com/office/word/2010/wordml" xmlns:w15="http://schemas.microsoft.com/office/word/2012/wordml" xmlns:w16cex="http://schemas.microsoft.com/office/word/2018/wordml/cex" xmlns:w16cid="http://schemas.microsoft.com/office/word/2016/wordml/cid" xmlns:w16="http://schemas.microsoft.com/office/word/2018/wordml" xmlns:w16du="http://schemas.microsoft.com/office/word/2023/wordml/word16du" xmlns:w16sdtdh="http://schemas.microsoft.com/office/word/2020/wordml/sdtdatahash" xmlns:w16sdtfl="http://schemas.microsoft.com/office/word/2024/wordml/sdtformatlock" xmlns:w16se="http://schemas.microsoft.com/office/word/2015/wordml/symex" xmlns:wpg="http://schemas.microsoft.com/office/word/2010/wordprocessingGroup" xmlns:wpi="http://schemas.microsoft.com/office/word/2010/wordprocessingInk" xmlns:wne="http://schemas.microsoft.com/office/word/2006/wordml" xmlns:wps="http://schemas.microsoft.com/office/word/2010/wordprocessingShape" mc:Ignorable="w14 w15 w16se w16cid w16 w16cex w16sdtdh w16sdtfl w16du wp14">
+<w:hdr xmlns:wpc="http://schemas.microsoft.com/office/word/2010/wordprocessingCanvas" xmlns:cx="http://schemas.microsoft.com/office/drawing/2014/chartex" xmlns:cx1="http://schemas.microsoft.com/office/drawing/2015/9/8/chartex" xmlns:cx2="http://schemas.microsoft.com/office/drawing/2015/10/21/chartex" xmlns:cx3="http://schemas.microsoft.com/office/drawing/2016/5/9/chartex" xmlns:cx4="http://schemas.microsoft.com/office/drawing/2016/5/10/chartex" xmlns:cx5="http://schemas.microsoft.com/office/drawing/2016/5/11/chartex" xmlns:cx6="http://schemas.microsoft.com/office/drawing/2016/5/12/chartex" xmlns:cx7="http://schemas.microsoft.com/office/drawing/2016/5/13/chartex" xmlns:cx8="http://schemas.microsoft.com/office/drawing/2016/5/14/chartex" xmlns:mc="http://schemas.openxmlformats.org/markup-compatibility/2006" xmlns:aink="http://schemas.microsoft.com/office/drawing/2016/ink" xmlns:am3d="http://schemas.microsoft.com/office/drawing/2017/model3d" xmlns:o="urn:schemas-microsoft-com:office:office" xmlns:oel="http://schemas.microsoft.com/office/2019/extlst" xmlns:r="http://schemas.openxmlformats.org/officeDocument/2006/relationships" xmlns:m="http://schemas.openxmlformats.org/officeDocument/2006/math" xmlns:v="urn:schemas-microsoft-com:vml" xmlns:wp14="http://schemas.microsoft.com/office/word/2010/wordprocessingDrawing" xmlns:wp="http://schemas.openxmlformats.org/drawingml/2006/wordprocessingDrawing" xmlns:w10="urn:schemas-microsoft-com:office:word" xmlns:w="http://schemas.openxmlformats.org/wordprocessingml/2006/main" xmlns:w14="http://schemas.microsoft.com/office/word/2010/wordml" xmlns:w15="http://schemas.microsoft.com/office/word/2012/wordml" xmlns:w16cex="http://schemas.microsoft.com/office/word/2018/wordml/cex" xmlns:w16cid="http://schemas.microsoft.com/office/word/2016/wordml/cid" xmlns:w16="http://schemas.microsoft.com/office/word/2018/wordml" xmlns:w16sdtdh="http://schemas.microsoft.com/office/word/2020/wordml/sdtdatahash" xmlns:w16se="http://schemas.microsoft.com/office/word/2015/wordml/symex" xmlns:wpg="http://schemas.microsoft.com/office/word/2010/wordprocessingGroup" xmlns:wpi="http://schemas.microsoft.com/office/word/2010/wordprocessingInk" xmlns:wne="http://schemas.microsoft.com/office/word/2006/wordml" xmlns:wps="http://schemas.microsoft.com/office/word/2010/wordprocessingShape" mc:Ignorable="w14 w15 w16se w16cid w16 w16cex w16sdtdh wp14">
   <w:p>
     <w:pPr>
       <w:pStyle w:val="Header"/>
@@ -25283,7 +24444,7 @@
 </file>
 
 <file path=word/numbering.xml><?xml version="1.0" encoding="utf-8"?>
-<w:numbering xmlns:wpc="http://schemas.microsoft.com/office/word/2010/wordprocessingCanvas" xmlns:cx="http://schemas.microsoft.com/office/drawing/2014/chartex" xmlns:cx1="http://schemas.microsoft.com/office/drawing/2015/9/8/chartex" xmlns:cx2="http://schemas.microsoft.com/office/drawing/2015/10/21/chartex" xmlns:cx3="http://schemas.microsoft.com/office/drawing/2016/5/9/chartex" xmlns:cx4="http://schemas.microsoft.com/office/drawing/2016/5/10/chartex" xmlns:cx5="http://schemas.microsoft.com/office/drawing/2016/5/11/chartex" xmlns:cx6="http://schemas.microsoft.com/office/drawing/2016/5/12/chartex" xmlns:cx7="http://schemas.microsoft.com/office/drawing/2016/5/13/chartex" xmlns:cx8="http://schemas.microsoft.com/office/drawing/2016/5/14/chartex" xmlns:mc="http://schemas.openxmlformats.org/markup-compatibility/2006" xmlns:aink="http://schemas.microsoft.com/office/drawing/2016/ink" xmlns:am3d="http://schemas.microsoft.com/office/drawing/2017/model3d" xmlns:o="urn:schemas-microsoft-com:office:office" xmlns:oel="http://schemas.microsoft.com/office/2019/extlst" xmlns:r="http://schemas.openxmlformats.org/officeDocument/2006/relationships" xmlns:m="http://schemas.openxmlformats.org/officeDocument/2006/math" xmlns:v="urn:schemas-microsoft-com:vml" xmlns:wp14="http://schemas.microsoft.com/office/word/2010/wordprocessingDrawing" xmlns:wp="http://schemas.openxmlformats.org/drawingml/2006/wordprocessingDrawing" xmlns:w10="urn:schemas-microsoft-com:office:word" xmlns:w="http://schemas.openxmlformats.org/wordprocessingml/2006/main" xmlns:w14="http://schemas.microsoft.com/office/word/2010/wordml" xmlns:w15="http://schemas.microsoft.com/office/word/2012/wordml" xmlns:w16cex="http://schemas.microsoft.com/office/word/2018/wordml/cex" xmlns:w16cid="http://schemas.microsoft.com/office/word/2016/wordml/cid" xmlns:w16="http://schemas.microsoft.com/office/word/2018/wordml" xmlns:w16du="http://schemas.microsoft.com/office/word/2023/wordml/word16du" xmlns:w16sdtdh="http://schemas.microsoft.com/office/word/2020/wordml/sdtdatahash" xmlns:w16sdtfl="http://schemas.microsoft.com/office/word/2024/wordml/sdtformatlock" xmlns:w16se="http://schemas.microsoft.com/office/word/2015/wordml/symex" xmlns:wpg="http://schemas.microsoft.com/office/word/2010/wordprocessingGroup" xmlns:wpi="http://schemas.microsoft.com/office/word/2010/wordprocessingInk" xmlns:wne="http://schemas.microsoft.com/office/word/2006/wordml" xmlns:wps="http://schemas.microsoft.com/office/word/2010/wordprocessingShape" mc:Ignorable="w14 w15 w16se w16cid w16 w16cex w16sdtdh w16sdtfl w16du wp14">
+<w:numbering xmlns:wpc="http://schemas.microsoft.com/office/word/2010/wordprocessingCanvas" xmlns:cx="http://schemas.microsoft.com/office/drawing/2014/chartex" xmlns:cx1="http://schemas.microsoft.com/office/drawing/2015/9/8/chartex" xmlns:cx2="http://schemas.microsoft.com/office/drawing/2015/10/21/chartex" xmlns:cx3="http://schemas.microsoft.com/office/drawing/2016/5/9/chartex" xmlns:cx4="http://schemas.microsoft.com/office/drawing/2016/5/10/chartex" xmlns:cx5="http://schemas.microsoft.com/office/drawing/2016/5/11/chartex" xmlns:cx6="http://schemas.microsoft.com/office/drawing/2016/5/12/chartex" xmlns:cx7="http://schemas.microsoft.com/office/drawing/2016/5/13/chartex" xmlns:cx8="http://schemas.microsoft.com/office/drawing/2016/5/14/chartex" xmlns:mc="http://schemas.openxmlformats.org/markup-compatibility/2006" xmlns:aink="http://schemas.microsoft.com/office/drawing/2016/ink" xmlns:am3d="http://schemas.microsoft.com/office/drawing/2017/model3d" xmlns:o="urn:schemas-microsoft-com:office:office" xmlns:oel="http://schemas.microsoft.com/office/2019/extlst" xmlns:r="http://schemas.openxmlformats.org/officeDocument/2006/relationships" xmlns:m="http://schemas.openxmlformats.org/officeDocument/2006/math" xmlns:v="urn:schemas-microsoft-com:vml" xmlns:wp14="http://schemas.microsoft.com/office/word/2010/wordprocessingDrawing" xmlns:wp="http://schemas.openxmlformats.org/drawingml/2006/wordprocessingDrawing" xmlns:w10="urn:schemas-microsoft-com:office:word" xmlns:w="http://schemas.openxmlformats.org/wordprocessingml/2006/main" xmlns:w14="http://schemas.microsoft.com/office/word/2010/wordml" xmlns:w15="http://schemas.microsoft.com/office/word/2012/wordml" xmlns:w16cex="http://schemas.microsoft.com/office/word/2018/wordml/cex" xmlns:w16cid="http://schemas.microsoft.com/office/word/2016/wordml/cid" xmlns:w16="http://schemas.microsoft.com/office/word/2018/wordml" xmlns:w16sdtdh="http://schemas.microsoft.com/office/word/2020/wordml/sdtdatahash" xmlns:w16se="http://schemas.microsoft.com/office/word/2015/wordml/symex" xmlns:wpg="http://schemas.microsoft.com/office/word/2010/wordprocessingGroup" xmlns:wpi="http://schemas.microsoft.com/office/word/2010/wordprocessingInk" xmlns:wne="http://schemas.microsoft.com/office/word/2006/wordml" xmlns:wps="http://schemas.microsoft.com/office/word/2010/wordprocessingShape" mc:Ignorable="w14 w15 w16se w16cid w16 w16cex w16sdtdh wp14">
   <w:abstractNum w:abstractNumId="0" w15:restartNumberingAfterBreak="0">
     <w:nsid w:val="1E4458F3"/>
     <w:multiLevelType w:val="hybridMultilevel"/>
@@ -26309,7 +25470,7 @@
 </file>
 
 <file path=word/styles.xml><?xml version="1.0" encoding="utf-8"?>
-<w:styles xmlns:mc="http://schemas.openxmlformats.org/markup-compatibility/2006" xmlns:r="http://schemas.openxmlformats.org/officeDocument/2006/relationships" xmlns:w="http://schemas.openxmlformats.org/wordprocessingml/2006/main" xmlns:w14="http://schemas.microsoft.com/office/word/2010/wordml" xmlns:w15="http://schemas.microsoft.com/office/word/2012/wordml" xmlns:w16cex="http://schemas.microsoft.com/office/word/2018/wordml/cex" xmlns:w16cid="http://schemas.microsoft.com/office/word/2016/wordml/cid" xmlns:w16="http://schemas.microsoft.com/office/word/2018/wordml" xmlns:w16du="http://schemas.microsoft.com/office/word/2023/wordml/word16du" xmlns:w16sdtdh="http://schemas.microsoft.com/office/word/2020/wordml/sdtdatahash" xmlns:w16sdtfl="http://schemas.microsoft.com/office/word/2024/wordml/sdtformatlock" xmlns:w16se="http://schemas.microsoft.com/office/word/2015/wordml/symex" mc:Ignorable="w14 w15 w16se w16cid w16 w16cex w16sdtdh w16sdtfl w16du">
+<w:styles xmlns:mc="http://schemas.openxmlformats.org/markup-compatibility/2006" xmlns:r="http://schemas.openxmlformats.org/officeDocument/2006/relationships" xmlns:w="http://schemas.openxmlformats.org/wordprocessingml/2006/main" xmlns:w14="http://schemas.microsoft.com/office/word/2010/wordml" xmlns:w15="http://schemas.microsoft.com/office/word/2012/wordml" xmlns:w16cex="http://schemas.microsoft.com/office/word/2018/wordml/cex" xmlns:w16cid="http://schemas.microsoft.com/office/word/2016/wordml/cid" xmlns:w16="http://schemas.microsoft.com/office/word/2018/wordml" xmlns:w16sdtdh="http://schemas.microsoft.com/office/word/2020/wordml/sdtdatahash" xmlns:w16se="http://schemas.microsoft.com/office/word/2015/wordml/symex" mc:Ignorable="w14 w15 w16se w16cid w16 w16cex w16sdtdh">
   <w:docDefaults>
     <w:rPrDefault>
       <w:rPr>
@@ -26711,6 +25872,7 @@
   <w:style w:type="character" w:default="1" w:styleId="DefaultParagraphFont">
     <w:name w:val="Default Paragraph Font"/>
     <w:uiPriority w:val="1"/>
+    <w:semiHidden/>
     <w:unhideWhenUsed/>
   </w:style>
   <w:style w:type="table" w:default="1" w:styleId="TableNormal">

</xml_diff>

<commit_message>
Fix PDF layout (table width, subtitles, list spacing, duplicate header) and add missing useEffect
</commit_message>
<xml_diff>
--- a/file dari media/003-Surat Undangan Welcome Day Pesantren Al Imam Al Islami.docx
+++ b/file dari media/003-Surat Undangan Welcome Day Pesantren Al Imam Al Islami.docx
@@ -1,5 +1,56 @@
 
-<file path=word/document.xml><?xml version="1.0" encoding="utf-8"?>
+<file path=docProps\app.xml><?xml version="1.0" encoding="utf-8"?>
+<Properties xmlns="http://schemas.openxmlformats.org/officeDocument/2006/extended-properties" xmlns:vt="http://schemas.openxmlformats.org/officeDocument/2006/docPropsVTypes">
+  <Template>Normal</Template>
+  <TotalTime>84</TotalTime>
+  <Pages>3</Pages>
+  <Words>3498</Words>
+  <Characters>19945</Characters>
+  <Application>Microsoft Office Word</Application>
+  <DocSecurity>0</DocSecurity>
+  <Lines>166</Lines>
+  <Paragraphs>46</Paragraphs>
+  <ScaleCrop>false</ScaleCrop>
+  <HeadingPairs>
+    <vt:vector size="2" baseType="variant">
+      <vt:variant>
+        <vt:lpstr>Title</vt:lpstr>
+      </vt:variant>
+      <vt:variant>
+        <vt:i4>1</vt:i4>
+      </vt:variant>
+    </vt:vector>
+  </HeadingPairs>
+  <TitlesOfParts>
+    <vt:vector size="1" baseType="lpstr">
+      <vt:lpstr/>
+    </vt:vector>
+  </TitlesOfParts>
+  <Company/>
+  <LinksUpToDate>false</LinksUpToDate>
+  <CharactersWithSpaces>23397</CharactersWithSpaces>
+  <SharedDoc>false</SharedDoc>
+  <HyperlinksChanged>false</HyperlinksChanged>
+  <AppVersion>16.0000</AppVersion>
+</Properties>
+</file>
+
+<file path=docProps\core.xml><?xml version="1.0" encoding="utf-8"?>
+<cp:coreProperties xmlns:cp="http://schemas.openxmlformats.org/package/2006/metadata/core-properties" xmlns:dc="http://purl.org/dc/elements/1.1/" xmlns:dcterms="http://purl.org/dc/terms/" xmlns:dcmitype="http://purl.org/dc/dcmitype/" xmlns:xsi="http://www.w3.org/2001/XMLSchema-instance">
+  <dc:title/>
+  <dc:subject/>
+  <dc:creator>abahjawiy</dc:creator>
+  <cp:keywords/>
+  <dc:description/>
+  <cp:lastModifiedBy>Rieza Eka Tomara</cp:lastModifiedBy>
+  <cp:revision>19</cp:revision>
+  <cp:lastPrinted>2026-06-11T04:36:00Z</cp:lastPrinted>
+  <dcterms:created xsi:type="dcterms:W3CDTF">2026-06-11T04:08:00Z</dcterms:created>
+  <dcterms:modified xsi:type="dcterms:W3CDTF">2026-07-03T07:06:00Z</dcterms:modified>
+</cp:coreProperties>
+</file>
+
+<file path=word\document.xml><?xml version="1.0" encoding="utf-8"?>
 <w:document xmlns:wpc="http://schemas.microsoft.com/office/word/2010/wordprocessingCanvas" xmlns:cx="http://schemas.microsoft.com/office/drawing/2014/chartex" xmlns:cx1="http://schemas.microsoft.com/office/drawing/2015/9/8/chartex" xmlns:cx2="http://schemas.microsoft.com/office/drawing/2015/10/21/chartex" xmlns:cx3="http://schemas.microsoft.com/office/drawing/2016/5/9/chartex" xmlns:cx4="http://schemas.microsoft.com/office/drawing/2016/5/10/chartex" xmlns:cx5="http://schemas.microsoft.com/office/drawing/2016/5/11/chartex" xmlns:cx6="http://schemas.microsoft.com/office/drawing/2016/5/12/chartex" xmlns:cx7="http://schemas.microsoft.com/office/drawing/2016/5/13/chartex" xmlns:cx8="http://schemas.microsoft.com/office/drawing/2016/5/14/chartex" xmlns:mc="http://schemas.openxmlformats.org/markup-compatibility/2006" xmlns:aink="http://schemas.microsoft.com/office/drawing/2016/ink" xmlns:am3d="http://schemas.microsoft.com/office/drawing/2017/model3d" xmlns:o="urn:schemas-microsoft-com:office:office" xmlns:oel="http://schemas.microsoft.com/office/2019/extlst" xmlns:r="http://schemas.openxmlformats.org/officeDocument/2006/relationships" xmlns:m="http://schemas.openxmlformats.org/officeDocument/2006/math" xmlns:v="urn:schemas-microsoft-com:vml" xmlns:wp14="http://schemas.microsoft.com/office/word/2010/wordprocessingDrawing" xmlns:wp="http://schemas.openxmlformats.org/drawingml/2006/wordprocessingDrawing" xmlns:w10="urn:schemas-microsoft-com:office:word" xmlns:w="http://schemas.openxmlformats.org/wordprocessingml/2006/main" xmlns:w14="http://schemas.microsoft.com/office/word/2010/wordml" xmlns:w15="http://schemas.microsoft.com/office/word/2012/wordml" xmlns:w16cex="http://schemas.microsoft.com/office/word/2018/wordml/cex" xmlns:w16cid="http://schemas.microsoft.com/office/word/2016/wordml/cid" xmlns:w16="http://schemas.microsoft.com/office/word/2018/wordml" xmlns:w16sdtdh="http://schemas.microsoft.com/office/word/2020/wordml/sdtdatahash" xmlns:w16se="http://schemas.microsoft.com/office/word/2015/wordml/symex" xmlns:wpg="http://schemas.microsoft.com/office/word/2010/wordprocessingGroup" xmlns:wpi="http://schemas.microsoft.com/office/word/2010/wordprocessingInk" xmlns:wne="http://schemas.microsoft.com/office/word/2006/wordml" xmlns:wps="http://schemas.microsoft.com/office/word/2010/wordprocessingShape" mc:Ignorable="w14 w15 w16se w16cid w16 w16cex w16sdtdh wp14">
   <w:body>
     <w:p>
@@ -24316,7 +24367,7 @@
 </w:document>
 </file>
 
-<file path=word/endnotes.xml><?xml version="1.0" encoding="utf-8"?>
+<file path=word\endnotes.xml><?xml version="1.0" encoding="utf-8"?>
 <w:endnotes xmlns:wpc="http://schemas.microsoft.com/office/word/2010/wordprocessingCanvas" xmlns:cx="http://schemas.microsoft.com/office/drawing/2014/chartex" xmlns:cx1="http://schemas.microsoft.com/office/drawing/2015/9/8/chartex" xmlns:cx2="http://schemas.microsoft.com/office/drawing/2015/10/21/chartex" xmlns:cx3="http://schemas.microsoft.com/office/drawing/2016/5/9/chartex" xmlns:cx4="http://schemas.microsoft.com/office/drawing/2016/5/10/chartex" xmlns:cx5="http://schemas.microsoft.com/office/drawing/2016/5/11/chartex" xmlns:cx6="http://schemas.microsoft.com/office/drawing/2016/5/12/chartex" xmlns:cx7="http://schemas.microsoft.com/office/drawing/2016/5/13/chartex" xmlns:cx8="http://schemas.microsoft.com/office/drawing/2016/5/14/chartex" xmlns:mc="http://schemas.openxmlformats.org/markup-compatibility/2006" xmlns:aink="http://schemas.microsoft.com/office/drawing/2016/ink" xmlns:am3d="http://schemas.microsoft.com/office/drawing/2017/model3d" xmlns:o="urn:schemas-microsoft-com:office:office" xmlns:oel="http://schemas.microsoft.com/office/2019/extlst" xmlns:r="http://schemas.openxmlformats.org/officeDocument/2006/relationships" xmlns:m="http://schemas.openxmlformats.org/officeDocument/2006/math" xmlns:v="urn:schemas-microsoft-com:vml" xmlns:wp14="http://schemas.microsoft.com/office/word/2010/wordprocessingDrawing" xmlns:wp="http://schemas.openxmlformats.org/drawingml/2006/wordprocessingDrawing" xmlns:w10="urn:schemas-microsoft-com:office:word" xmlns:w="http://schemas.openxmlformats.org/wordprocessingml/2006/main" xmlns:w14="http://schemas.microsoft.com/office/word/2010/wordml" xmlns:w15="http://schemas.microsoft.com/office/word/2012/wordml" xmlns:w16cex="http://schemas.microsoft.com/office/word/2018/wordml/cex" xmlns:w16cid="http://schemas.microsoft.com/office/word/2016/wordml/cid" xmlns:w16="http://schemas.microsoft.com/office/word/2018/wordml" xmlns:w16sdtdh="http://schemas.microsoft.com/office/word/2020/wordml/sdtdatahash" xmlns:w16se="http://schemas.microsoft.com/office/word/2015/wordml/symex" xmlns:wpg="http://schemas.microsoft.com/office/word/2010/wordprocessingGroup" xmlns:wpi="http://schemas.microsoft.com/office/word/2010/wordprocessingInk" xmlns:wne="http://schemas.microsoft.com/office/word/2006/wordml" xmlns:wps="http://schemas.microsoft.com/office/word/2010/wordprocessingShape" mc:Ignorable="w14 w15 w16se w16cid w16 w16cex w16sdtdh wp14">
   <w:endnote w:type="separator" w:id="-1">
     <w:p>
@@ -24341,7 +24392,74 @@
 </w:endnotes>
 </file>
 
-<file path=word/footnotes.xml><?xml version="1.0" encoding="utf-8"?>
+<file path=word\fontTable.xml><?xml version="1.0" encoding="utf-8"?>
+<w:fonts xmlns:mc="http://schemas.openxmlformats.org/markup-compatibility/2006" xmlns:r="http://schemas.openxmlformats.org/officeDocument/2006/relationships" xmlns:w="http://schemas.openxmlformats.org/wordprocessingml/2006/main" xmlns:w14="http://schemas.microsoft.com/office/word/2010/wordml" xmlns:w15="http://schemas.microsoft.com/office/word/2012/wordml" xmlns:w16cex="http://schemas.microsoft.com/office/word/2018/wordml/cex" xmlns:w16cid="http://schemas.microsoft.com/office/word/2016/wordml/cid" xmlns:w16="http://schemas.microsoft.com/office/word/2018/wordml" xmlns:w16sdtdh="http://schemas.microsoft.com/office/word/2020/wordml/sdtdatahash" xmlns:w16se="http://schemas.microsoft.com/office/word/2015/wordml/symex" mc:Ignorable="w14 w15 w16se w16cid w16 w16cex w16sdtdh">
+  <w:font w:name="Times New Roman">
+    <w:panose1 w:val="02020603050405020304"/>
+    <w:charset w:val="00"/>
+    <w:family w:val="roman"/>
+    <w:pitch w:val="variable"/>
+    <w:sig w:usb0="E0002EFF" w:usb1="C000785B" w:usb2="00000009" w:usb3="00000000" w:csb0="000001FF" w:csb1="00000000"/>
+  </w:font>
+  <w:font w:name="Calibri">
+    <w:panose1 w:val="020F0502020204030204"/>
+    <w:charset w:val="00"/>
+    <w:family w:val="swiss"/>
+    <w:pitch w:val="variable"/>
+    <w:sig w:usb0="E4002EFF" w:usb1="C200247B" w:usb2="00000009" w:usb3="00000000" w:csb0="000001FF" w:csb1="00000000"/>
+  </w:font>
+  <w:font w:name="Courier New">
+    <w:panose1 w:val="02070309020205020404"/>
+    <w:charset w:val="00"/>
+    <w:family w:val="modern"/>
+    <w:pitch w:val="fixed"/>
+    <w:sig w:usb0="E0002EFF" w:usb1="C0007843" w:usb2="00000009" w:usb3="00000000" w:csb0="000001FF" w:csb1="00000000"/>
+  </w:font>
+  <w:font w:name="Wingdings">
+    <w:panose1 w:val="05000000000000000000"/>
+    <w:charset w:val="02"/>
+    <w:family w:val="auto"/>
+    <w:pitch w:val="variable"/>
+    <w:sig w:usb0="00000000" w:usb1="10000000" w:usb2="00000000" w:usb3="00000000" w:csb0="80000000" w:csb1="00000000"/>
+  </w:font>
+  <w:font w:name="Symbol">
+    <w:panose1 w:val="05050102010706020507"/>
+    <w:charset w:val="02"/>
+    <w:family w:val="roman"/>
+    <w:pitch w:val="variable"/>
+    <w:sig w:usb0="00000000" w:usb1="10000000" w:usb2="00000000" w:usb3="00000000" w:csb0="80000000" w:csb1="00000000"/>
+  </w:font>
+  <w:font w:name="Arial">
+    <w:panose1 w:val="020B0604020202020204"/>
+    <w:charset w:val="00"/>
+    <w:family w:val="swiss"/>
+    <w:pitch w:val="variable"/>
+    <w:sig w:usb0="E0002EFF" w:usb1="C000785B" w:usb2="00000009" w:usb3="00000000" w:csb0="000001FF" w:csb1="00000000"/>
+  </w:font>
+  <w:font w:name="(A) Arslan Wessam A">
+    <w:altName w:val="Arial"/>
+    <w:charset w:val="00"/>
+    <w:family w:val="script"/>
+    <w:pitch w:val="variable"/>
+    <w:sig w:usb0="80002063" w:usb1="80002040" w:usb2="00000008" w:usb3="00000000" w:csb0="00000041" w:csb1="00000000"/>
+  </w:font>
+  <w:font w:name="Traditional Arabic">
+    <w:charset w:val="B2"/>
+    <w:family w:val="roman"/>
+    <w:pitch w:val="variable"/>
+    <w:sig w:usb0="00002003" w:usb1="80000000" w:usb2="00000008" w:usb3="00000000" w:csb0="00000041" w:csb1="00000000"/>
+  </w:font>
+  <w:font w:name="Calibri Light">
+    <w:panose1 w:val="020F0302020204030204"/>
+    <w:charset w:val="00"/>
+    <w:family w:val="swiss"/>
+    <w:pitch w:val="variable"/>
+    <w:sig w:usb0="E4002EFF" w:usb1="C200247B" w:usb2="00000009" w:usb3="00000000" w:csb0="000001FF" w:csb1="00000000"/>
+  </w:font>
+</w:fonts>
+</file>
+
+<file path=word\footnotes.xml><?xml version="1.0" encoding="utf-8"?>
 <w:footnotes xmlns:wpc="http://schemas.microsoft.com/office/word/2010/wordprocessingCanvas" xmlns:cx="http://schemas.microsoft.com/office/drawing/2014/chartex" xmlns:cx1="http://schemas.microsoft.com/office/drawing/2015/9/8/chartex" xmlns:cx2="http://schemas.microsoft.com/office/drawing/2015/10/21/chartex" xmlns:cx3="http://schemas.microsoft.com/office/drawing/2016/5/9/chartex" xmlns:cx4="http://schemas.microsoft.com/office/drawing/2016/5/10/chartex" xmlns:cx5="http://schemas.microsoft.com/office/drawing/2016/5/11/chartex" xmlns:cx6="http://schemas.microsoft.com/office/drawing/2016/5/12/chartex" xmlns:cx7="http://schemas.microsoft.com/office/drawing/2016/5/13/chartex" xmlns:cx8="http://schemas.microsoft.com/office/drawing/2016/5/14/chartex" xmlns:mc="http://schemas.openxmlformats.org/markup-compatibility/2006" xmlns:aink="http://schemas.microsoft.com/office/drawing/2016/ink" xmlns:am3d="http://schemas.microsoft.com/office/drawing/2017/model3d" xmlns:o="urn:schemas-microsoft-com:office:office" xmlns:oel="http://schemas.microsoft.com/office/2019/extlst" xmlns:r="http://schemas.openxmlformats.org/officeDocument/2006/relationships" xmlns:m="http://schemas.openxmlformats.org/officeDocument/2006/math" xmlns:v="urn:schemas-microsoft-com:vml" xmlns:wp14="http://schemas.microsoft.com/office/word/2010/wordprocessingDrawing" xmlns:wp="http://schemas.openxmlformats.org/drawingml/2006/wordprocessingDrawing" xmlns:w10="urn:schemas-microsoft-com:office:word" xmlns:w="http://schemas.openxmlformats.org/wordprocessingml/2006/main" xmlns:w14="http://schemas.microsoft.com/office/word/2010/wordml" xmlns:w15="http://schemas.microsoft.com/office/word/2012/wordml" xmlns:w16cex="http://schemas.microsoft.com/office/word/2018/wordml/cex" xmlns:w16cid="http://schemas.microsoft.com/office/word/2016/wordml/cid" xmlns:w16="http://schemas.microsoft.com/office/word/2018/wordml" xmlns:w16sdtdh="http://schemas.microsoft.com/office/word/2020/wordml/sdtdatahash" xmlns:w16se="http://schemas.microsoft.com/office/word/2015/wordml/symex" xmlns:wpg="http://schemas.microsoft.com/office/word/2010/wordprocessingGroup" xmlns:wpi="http://schemas.microsoft.com/office/word/2010/wordprocessingInk" xmlns:wne="http://schemas.microsoft.com/office/word/2006/wordml" xmlns:wps="http://schemas.microsoft.com/office/word/2010/wordprocessingShape" mc:Ignorable="w14 w15 w16se w16cid w16 w16cex w16sdtdh wp14">
   <w:footnote w:type="separator" w:id="-1">
     <w:p>
@@ -24366,7 +24484,7 @@
 </w:footnotes>
 </file>
 
-<file path=word/header1.xml><?xml version="1.0" encoding="utf-8"?>
+<file path=word\header1.xml><?xml version="1.0" encoding="utf-8"?>
 <w:hdr xmlns:wpc="http://schemas.microsoft.com/office/word/2010/wordprocessingCanvas" xmlns:cx="http://schemas.microsoft.com/office/drawing/2014/chartex" xmlns:cx1="http://schemas.microsoft.com/office/drawing/2015/9/8/chartex" xmlns:cx2="http://schemas.microsoft.com/office/drawing/2015/10/21/chartex" xmlns:cx3="http://schemas.microsoft.com/office/drawing/2016/5/9/chartex" xmlns:cx4="http://schemas.microsoft.com/office/drawing/2016/5/10/chartex" xmlns:cx5="http://schemas.microsoft.com/office/drawing/2016/5/11/chartex" xmlns:cx6="http://schemas.microsoft.com/office/drawing/2016/5/12/chartex" xmlns:cx7="http://schemas.microsoft.com/office/drawing/2016/5/13/chartex" xmlns:cx8="http://schemas.microsoft.com/office/drawing/2016/5/14/chartex" xmlns:mc="http://schemas.openxmlformats.org/markup-compatibility/2006" xmlns:aink="http://schemas.microsoft.com/office/drawing/2016/ink" xmlns:am3d="http://schemas.microsoft.com/office/drawing/2017/model3d" xmlns:o="urn:schemas-microsoft-com:office:office" xmlns:oel="http://schemas.microsoft.com/office/2019/extlst" xmlns:r="http://schemas.openxmlformats.org/officeDocument/2006/relationships" xmlns:m="http://schemas.openxmlformats.org/officeDocument/2006/math" xmlns:v="urn:schemas-microsoft-com:vml" xmlns:wp14="http://schemas.microsoft.com/office/word/2010/wordprocessingDrawing" xmlns:wp="http://schemas.openxmlformats.org/drawingml/2006/wordprocessingDrawing" xmlns:w10="urn:schemas-microsoft-com:office:word" xmlns:w="http://schemas.openxmlformats.org/wordprocessingml/2006/main" xmlns:w14="http://schemas.microsoft.com/office/word/2010/wordml" xmlns:w15="http://schemas.microsoft.com/office/word/2012/wordml" xmlns:w16cex="http://schemas.microsoft.com/office/word/2018/wordml/cex" xmlns:w16cid="http://schemas.microsoft.com/office/word/2016/wordml/cid" xmlns:w16="http://schemas.microsoft.com/office/word/2018/wordml" xmlns:w16sdtdh="http://schemas.microsoft.com/office/word/2020/wordml/sdtdatahash" xmlns:w16se="http://schemas.microsoft.com/office/word/2015/wordml/symex" xmlns:wpg="http://schemas.microsoft.com/office/word/2010/wordprocessingGroup" xmlns:wpi="http://schemas.microsoft.com/office/word/2010/wordprocessingInk" xmlns:wne="http://schemas.microsoft.com/office/word/2006/wordml" xmlns:wps="http://schemas.microsoft.com/office/word/2010/wordprocessingShape" mc:Ignorable="w14 w15 w16se w16cid w16 w16cex w16sdtdh wp14">
   <w:p>
     <w:pPr>
@@ -24443,7 +24561,7 @@
 </w:hdr>
 </file>
 
-<file path=word/numbering.xml><?xml version="1.0" encoding="utf-8"?>
+<file path=word\numbering.xml><?xml version="1.0" encoding="utf-8"?>
 <w:numbering xmlns:wpc="http://schemas.microsoft.com/office/word/2010/wordprocessingCanvas" xmlns:cx="http://schemas.microsoft.com/office/drawing/2014/chartex" xmlns:cx1="http://schemas.microsoft.com/office/drawing/2015/9/8/chartex" xmlns:cx2="http://schemas.microsoft.com/office/drawing/2015/10/21/chartex" xmlns:cx3="http://schemas.microsoft.com/office/drawing/2016/5/9/chartex" xmlns:cx4="http://schemas.microsoft.com/office/drawing/2016/5/10/chartex" xmlns:cx5="http://schemas.microsoft.com/office/drawing/2016/5/11/chartex" xmlns:cx6="http://schemas.microsoft.com/office/drawing/2016/5/12/chartex" xmlns:cx7="http://schemas.microsoft.com/office/drawing/2016/5/13/chartex" xmlns:cx8="http://schemas.microsoft.com/office/drawing/2016/5/14/chartex" xmlns:mc="http://schemas.openxmlformats.org/markup-compatibility/2006" xmlns:aink="http://schemas.microsoft.com/office/drawing/2016/ink" xmlns:am3d="http://schemas.microsoft.com/office/drawing/2017/model3d" xmlns:o="urn:schemas-microsoft-com:office:office" xmlns:oel="http://schemas.microsoft.com/office/2019/extlst" xmlns:r="http://schemas.openxmlformats.org/officeDocument/2006/relationships" xmlns:m="http://schemas.openxmlformats.org/officeDocument/2006/math" xmlns:v="urn:schemas-microsoft-com:vml" xmlns:wp14="http://schemas.microsoft.com/office/word/2010/wordprocessingDrawing" xmlns:wp="http://schemas.openxmlformats.org/drawingml/2006/wordprocessingDrawing" xmlns:w10="urn:schemas-microsoft-com:office:word" xmlns:w="http://schemas.openxmlformats.org/wordprocessingml/2006/main" xmlns:w14="http://schemas.microsoft.com/office/word/2010/wordml" xmlns:w15="http://schemas.microsoft.com/office/word/2012/wordml" xmlns:w16cex="http://schemas.microsoft.com/office/word/2018/wordml/cex" xmlns:w16cid="http://schemas.microsoft.com/office/word/2016/wordml/cid" xmlns:w16="http://schemas.microsoft.com/office/word/2018/wordml" xmlns:w16sdtdh="http://schemas.microsoft.com/office/word/2020/wordml/sdtdatahash" xmlns:w16se="http://schemas.microsoft.com/office/word/2015/wordml/symex" xmlns:wpg="http://schemas.microsoft.com/office/word/2010/wordprocessingGroup" xmlns:wpi="http://schemas.microsoft.com/office/word/2010/wordprocessingInk" xmlns:wne="http://schemas.microsoft.com/office/word/2006/wordml" xmlns:wps="http://schemas.microsoft.com/office/word/2010/wordprocessingShape" mc:Ignorable="w14 w15 w16se w16cid w16 w16cex w16sdtdh wp14">
   <w:abstractNum w:abstractNumId="0" w15:restartNumberingAfterBreak="0">
     <w:nsid w:val="1E4458F3"/>
@@ -25469,7 +25587,221 @@
 </w:numbering>
 </file>
 
-<file path=word/styles.xml><?xml version="1.0" encoding="utf-8"?>
+<file path=word\settings.xml><?xml version="1.0" encoding="utf-8"?>
+<w:settings xmlns:mc="http://schemas.openxmlformats.org/markup-compatibility/2006" xmlns:o="urn:schemas-microsoft-com:office:office" xmlns:r="http://schemas.openxmlformats.org/officeDocument/2006/relationships" xmlns:m="http://schemas.openxmlformats.org/officeDocument/2006/math" xmlns:v="urn:schemas-microsoft-com:vml" xmlns:w10="urn:schemas-microsoft-com:office:word" xmlns:w="http://schemas.openxmlformats.org/wordprocessingml/2006/main" xmlns:w14="http://schemas.microsoft.com/office/word/2010/wordml" xmlns:w15="http://schemas.microsoft.com/office/word/2012/wordml" xmlns:w16cex="http://schemas.microsoft.com/office/word/2018/wordml/cex" xmlns:w16cid="http://schemas.microsoft.com/office/word/2016/wordml/cid" xmlns:w16="http://schemas.microsoft.com/office/word/2018/wordml" xmlns:w16sdtdh="http://schemas.microsoft.com/office/word/2020/wordml/sdtdatahash" xmlns:w16se="http://schemas.microsoft.com/office/word/2015/wordml/symex" xmlns:sl="http://schemas.openxmlformats.org/schemaLibrary/2006/main" mc:Ignorable="w14 w15 w16se w16cid w16 w16cex w16sdtdh">
+  <w:zoom w:percent="100"/>
+  <w:defaultTabStop w:val="720"/>
+  <w:characterSpacingControl w:val="doNotCompress"/>
+  <w:hdrShapeDefaults>
+    <o:shapedefaults v:ext="edit" spidmax="2050"/>
+  </w:hdrShapeDefaults>
+  <w:footnotePr>
+    <w:footnote w:id="-1"/>
+    <w:footnote w:id="0"/>
+  </w:footnotePr>
+  <w:endnotePr>
+    <w:endnote w:id="-1"/>
+    <w:endnote w:id="0"/>
+  </w:endnotePr>
+  <w:compat>
+    <w:compatSetting w:name="compatibilityMode" w:uri="http://schemas.microsoft.com/office/word" w:val="15"/>
+    <w:compatSetting w:name="overrideTableStyleFontSizeAndJustification" w:uri="http://schemas.microsoft.com/office/word" w:val="1"/>
+    <w:compatSetting w:name="enableOpenTypeFeatures" w:uri="http://schemas.microsoft.com/office/word" w:val="1"/>
+    <w:compatSetting w:name="doNotFlipMirrorIndents" w:uri="http://schemas.microsoft.com/office/word" w:val="1"/>
+    <w:compatSetting w:name="differentiateMultirowTableHeaders" w:uri="http://schemas.microsoft.com/office/word" w:val="1"/>
+    <w:compatSetting w:name="useWord2013TrackBottomHyphenation" w:uri="http://schemas.microsoft.com/office/word" w:val="0"/>
+  </w:compat>
+  <w:rsids>
+    <w:rsidRoot w:val="001C21C8"/>
+    <w:rsid w:val="00033D32"/>
+    <w:rsid w:val="00045CEA"/>
+    <w:rsid w:val="00062C36"/>
+    <w:rsid w:val="000810CB"/>
+    <w:rsid w:val="0008737C"/>
+    <w:rsid w:val="0009406D"/>
+    <w:rsid w:val="000A0476"/>
+    <w:rsid w:val="000A176B"/>
+    <w:rsid w:val="000A42A0"/>
+    <w:rsid w:val="000A7D03"/>
+    <w:rsid w:val="000B4584"/>
+    <w:rsid w:val="000C1B7B"/>
+    <w:rsid w:val="000E073B"/>
+    <w:rsid w:val="000F5F65"/>
+    <w:rsid w:val="00101324"/>
+    <w:rsid w:val="0010304E"/>
+    <w:rsid w:val="00117F5F"/>
+    <w:rsid w:val="001711D5"/>
+    <w:rsid w:val="0017407A"/>
+    <w:rsid w:val="001C0E9B"/>
+    <w:rsid w:val="001C21C8"/>
+    <w:rsid w:val="001D1166"/>
+    <w:rsid w:val="001E74A7"/>
+    <w:rsid w:val="002352E1"/>
+    <w:rsid w:val="00243E8D"/>
+    <w:rsid w:val="002705BB"/>
+    <w:rsid w:val="00296C7E"/>
+    <w:rsid w:val="002E3BBE"/>
+    <w:rsid w:val="002F5E4C"/>
+    <w:rsid w:val="0032075C"/>
+    <w:rsid w:val="00351C99"/>
+    <w:rsid w:val="0036328D"/>
+    <w:rsid w:val="00371C1F"/>
+    <w:rsid w:val="00381501"/>
+    <w:rsid w:val="00384171"/>
+    <w:rsid w:val="003A0DC4"/>
+    <w:rsid w:val="003A3F61"/>
+    <w:rsid w:val="003E05F3"/>
+    <w:rsid w:val="00444EFC"/>
+    <w:rsid w:val="0048392D"/>
+    <w:rsid w:val="00483DEF"/>
+    <w:rsid w:val="004929D7"/>
+    <w:rsid w:val="004A0151"/>
+    <w:rsid w:val="004A207E"/>
+    <w:rsid w:val="004A2E4E"/>
+    <w:rsid w:val="004B24C9"/>
+    <w:rsid w:val="004C2DA7"/>
+    <w:rsid w:val="004C7D91"/>
+    <w:rsid w:val="004E6256"/>
+    <w:rsid w:val="004F3E1A"/>
+    <w:rsid w:val="00502D6A"/>
+    <w:rsid w:val="00506F48"/>
+    <w:rsid w:val="005120CC"/>
+    <w:rsid w:val="00513EF7"/>
+    <w:rsid w:val="00571A37"/>
+    <w:rsid w:val="00577F9E"/>
+    <w:rsid w:val="00580365"/>
+    <w:rsid w:val="005944AC"/>
+    <w:rsid w:val="00622BC8"/>
+    <w:rsid w:val="00622C34"/>
+    <w:rsid w:val="00631091"/>
+    <w:rsid w:val="006424A0"/>
+    <w:rsid w:val="00656A35"/>
+    <w:rsid w:val="00673E8B"/>
+    <w:rsid w:val="00676A62"/>
+    <w:rsid w:val="00694F90"/>
+    <w:rsid w:val="006A66B8"/>
+    <w:rsid w:val="006B70A7"/>
+    <w:rsid w:val="006F08BE"/>
+    <w:rsid w:val="0071213E"/>
+    <w:rsid w:val="007149CE"/>
+    <w:rsid w:val="00731AA6"/>
+    <w:rsid w:val="00732728"/>
+    <w:rsid w:val="0075548E"/>
+    <w:rsid w:val="007638EF"/>
+    <w:rsid w:val="007761E5"/>
+    <w:rsid w:val="0078090C"/>
+    <w:rsid w:val="007A045C"/>
+    <w:rsid w:val="0080546A"/>
+    <w:rsid w:val="008126A5"/>
+    <w:rsid w:val="00823A2E"/>
+    <w:rsid w:val="00826057"/>
+    <w:rsid w:val="008448AE"/>
+    <w:rsid w:val="008518CF"/>
+    <w:rsid w:val="008809AD"/>
+    <w:rsid w:val="008815B8"/>
+    <w:rsid w:val="00883787"/>
+    <w:rsid w:val="0088687A"/>
+    <w:rsid w:val="008A16D6"/>
+    <w:rsid w:val="008B7AA5"/>
+    <w:rsid w:val="008C605B"/>
+    <w:rsid w:val="008D54A1"/>
+    <w:rsid w:val="008E2ECE"/>
+    <w:rsid w:val="008E5E41"/>
+    <w:rsid w:val="008E68C6"/>
+    <w:rsid w:val="00905546"/>
+    <w:rsid w:val="00907F7E"/>
+    <w:rsid w:val="009109F5"/>
+    <w:rsid w:val="009153F1"/>
+    <w:rsid w:val="00933419"/>
+    <w:rsid w:val="00936CC9"/>
+    <w:rsid w:val="00951D51"/>
+    <w:rsid w:val="00963788"/>
+    <w:rsid w:val="00965D19"/>
+    <w:rsid w:val="00972E5E"/>
+    <w:rsid w:val="009832F2"/>
+    <w:rsid w:val="00983AC5"/>
+    <w:rsid w:val="00990C15"/>
+    <w:rsid w:val="009913B3"/>
+    <w:rsid w:val="00993E9E"/>
+    <w:rsid w:val="00994A97"/>
+    <w:rsid w:val="009B6424"/>
+    <w:rsid w:val="009F3D06"/>
+    <w:rsid w:val="009F44DB"/>
+    <w:rsid w:val="00A353F0"/>
+    <w:rsid w:val="00A570BF"/>
+    <w:rsid w:val="00A60445"/>
+    <w:rsid w:val="00A8244E"/>
+    <w:rsid w:val="00A92DBC"/>
+    <w:rsid w:val="00AD31BA"/>
+    <w:rsid w:val="00AD6BAF"/>
+    <w:rsid w:val="00AE32B9"/>
+    <w:rsid w:val="00AE6835"/>
+    <w:rsid w:val="00B02058"/>
+    <w:rsid w:val="00B30722"/>
+    <w:rsid w:val="00B60F11"/>
+    <w:rsid w:val="00B65FC6"/>
+    <w:rsid w:val="00C36542"/>
+    <w:rsid w:val="00C520A4"/>
+    <w:rsid w:val="00C530C4"/>
+    <w:rsid w:val="00C541DB"/>
+    <w:rsid w:val="00C560C8"/>
+    <w:rsid w:val="00C868F1"/>
+    <w:rsid w:val="00CE1903"/>
+    <w:rsid w:val="00CE2EE6"/>
+    <w:rsid w:val="00CE67BA"/>
+    <w:rsid w:val="00D155B6"/>
+    <w:rsid w:val="00D16B69"/>
+    <w:rsid w:val="00D34ACD"/>
+    <w:rsid w:val="00D41100"/>
+    <w:rsid w:val="00D42901"/>
+    <w:rsid w:val="00D7194A"/>
+    <w:rsid w:val="00DC7DD6"/>
+    <w:rsid w:val="00DE3EA2"/>
+    <w:rsid w:val="00E05300"/>
+    <w:rsid w:val="00E12593"/>
+    <w:rsid w:val="00E22E2E"/>
+    <w:rsid w:val="00E3442A"/>
+    <w:rsid w:val="00E67EF9"/>
+    <w:rsid w:val="00E71D55"/>
+    <w:rsid w:val="00EA17A2"/>
+    <w:rsid w:val="00EE2ECD"/>
+    <w:rsid w:val="00EF2716"/>
+    <w:rsid w:val="00F0462B"/>
+    <w:rsid w:val="00F31916"/>
+    <w:rsid w:val="00F427A6"/>
+    <w:rsid w:val="00FA299A"/>
+    <w:rsid w:val="00FB354C"/>
+    <w:rsid w:val="00FE37A9"/>
+  </w:rsids>
+  <m:mathPr>
+    <m:mathFont m:val="Cambria Math"/>
+    <m:brkBin m:val="before"/>
+    <m:brkBinSub m:val="--"/>
+    <m:smallFrac m:val="0"/>
+    <m:dispDef/>
+    <m:lMargin m:val="0"/>
+    <m:rMargin m:val="0"/>
+    <m:defJc m:val="centerGroup"/>
+    <m:wrapIndent m:val="1440"/>
+    <m:intLim m:val="subSup"/>
+    <m:naryLim m:val="undOvr"/>
+  </m:mathPr>
+  <w:themeFontLang w:val="en-US" w:bidi="ar-SA"/>
+  <w:clrSchemeMapping w:bg1="light1" w:t1="dark1" w:bg2="light2" w:t2="dark2" w:accent1="accent1" w:accent2="accent2" w:accent3="accent3" w:accent4="accent4" w:accent5="accent5" w:accent6="accent6" w:hyperlink="hyperlink" w:followedHyperlink="followedHyperlink"/>
+  <w:shapeDefaults>
+    <o:shapedefaults v:ext="edit" spidmax="2050"/>
+    <o:shapelayout v:ext="edit">
+      <o:idmap v:ext="edit" data="2"/>
+    </o:shapelayout>
+  </w:shapeDefaults>
+  <w:decimalSymbol w:val=","/>
+  <w:listSeparator w:val=";"/>
+  <w14:docId w14:val="39EA83F1"/>
+  <w15:docId w15:val="{3611E0A5-2192-4383-8709-7CDCDD8E9230}"/>
+</w:settings>
+</file>
+
+<file path=word\styles.xml><?xml version="1.0" encoding="utf-8"?>
 <w:styles xmlns:mc="http://schemas.openxmlformats.org/markup-compatibility/2006" xmlns:r="http://schemas.openxmlformats.org/officeDocument/2006/relationships" xmlns:w="http://schemas.openxmlformats.org/wordprocessingml/2006/main" xmlns:w14="http://schemas.microsoft.com/office/word/2010/wordml" xmlns:w15="http://schemas.microsoft.com/office/word/2012/wordml" xmlns:w16cex="http://schemas.microsoft.com/office/word/2018/wordml/cex" xmlns:w16cid="http://schemas.microsoft.com/office/word/2016/wordml/cid" xmlns:w16="http://schemas.microsoft.com/office/word/2018/wordml" xmlns:w16sdtdh="http://schemas.microsoft.com/office/word/2020/wordml/sdtdatahash" xmlns:w16se="http://schemas.microsoft.com/office/word/2015/wordml/symex" mc:Ignorable="w14 w15 w16se w16cid w16 w16cex w16sdtdh">
   <w:docDefaults>
     <w:rPrDefault>
@@ -26024,7 +26356,7 @@
 </w:styles>
 </file>
 
-<file path=word/theme/theme1.xml><?xml version="1.0" encoding="utf-8"?>
+<file path=word\theme\theme1.xml><?xml version="1.0" encoding="utf-8"?>
 <a:theme xmlns:a="http://schemas.openxmlformats.org/drawingml/2006/main" name="Office Theme">
   <a:themeElements>
     <a:clrScheme name="Office">
@@ -26317,4 +26649,52 @@
     </a:ext>
   </a:extLst>
 </a:theme>
+</file>
+
+<file path=word\webSettings.xml><?xml version="1.0" encoding="utf-8"?>
+<w:webSettings xmlns:mc="http://schemas.openxmlformats.org/markup-compatibility/2006" xmlns:r="http://schemas.openxmlformats.org/officeDocument/2006/relationships" xmlns:w="http://schemas.openxmlformats.org/wordprocessingml/2006/main" xmlns:w14="http://schemas.microsoft.com/office/word/2010/wordml" xmlns:w15="http://schemas.microsoft.com/office/word/2012/wordml" xmlns:w16cex="http://schemas.microsoft.com/office/word/2018/wordml/cex" xmlns:w16cid="http://schemas.microsoft.com/office/word/2016/wordml/cid" xmlns:w16="http://schemas.microsoft.com/office/word/2018/wordml" xmlns:w16sdtdh="http://schemas.microsoft.com/office/word/2020/wordml/sdtdatahash" xmlns:w16se="http://schemas.microsoft.com/office/word/2015/wordml/symex" mc:Ignorable="w14 w15 w16se w16cid w16 w16cex w16sdtdh">
+  <w:divs>
+    <w:div w:id="937250390">
+      <w:bodyDiv w:val="1"/>
+      <w:marLeft w:val="0"/>
+      <w:marRight w:val="0"/>
+      <w:marTop w:val="0"/>
+      <w:marBottom w:val="0"/>
+      <w:divBdr>
+        <w:top w:val="none" w:sz="0" w:space="0" w:color="auto"/>
+        <w:left w:val="none" w:sz="0" w:space="0" w:color="auto"/>
+        <w:bottom w:val="none" w:sz="0" w:space="0" w:color="auto"/>
+        <w:right w:val="none" w:sz="0" w:space="0" w:color="auto"/>
+      </w:divBdr>
+    </w:div>
+    <w:div w:id="1062027316">
+      <w:bodyDiv w:val="1"/>
+      <w:marLeft w:val="0"/>
+      <w:marRight w:val="0"/>
+      <w:marTop w:val="0"/>
+      <w:marBottom w:val="0"/>
+      <w:divBdr>
+        <w:top w:val="none" w:sz="0" w:space="0" w:color="auto"/>
+        <w:left w:val="none" w:sz="0" w:space="0" w:color="auto"/>
+        <w:bottom w:val="none" w:sz="0" w:space="0" w:color="auto"/>
+        <w:right w:val="none" w:sz="0" w:space="0" w:color="auto"/>
+      </w:divBdr>
+    </w:div>
+    <w:div w:id="1279995431">
+      <w:bodyDiv w:val="1"/>
+      <w:marLeft w:val="0"/>
+      <w:marRight w:val="0"/>
+      <w:marTop w:val="0"/>
+      <w:marBottom w:val="0"/>
+      <w:divBdr>
+        <w:top w:val="none" w:sz="0" w:space="0" w:color="auto"/>
+        <w:left w:val="none" w:sz="0" w:space="0" w:color="auto"/>
+        <w:bottom w:val="none" w:sz="0" w:space="0" w:color="auto"/>
+        <w:right w:val="none" w:sz="0" w:space="0" w:color="auto"/>
+      </w:divBdr>
+    </w:div>
+  </w:divs>
+  <w:relyOnVML/>
+  <w:allowPNG/>
+</w:webSettings>
 </file>
</xml_diff>